<commit_message>
Completed design doc and database sql
</commit_message>
<xml_diff>
--- a/DataBase/doc/db design doc.docx
+++ b/DataBase/doc/db design doc.docx
@@ -10708,9 +10708,6 @@
           <w:ilvl w:val="0"/>
           <w:numId w:val="1"/>
         </w:numPr>
-        <w:rPr>
-          <w:rFonts w:hint="eastAsia"/>
-        </w:rPr>
       </w:pPr>
       <w:r>
         <w:rPr>
@@ -10724,6 +10721,927 @@
       <w:r>
         <w:t>.</w:t>
       </w:r>
+    </w:p>
+    <w:p/>
+    <w:p>
+      <w:pPr>
+        <w:pStyle w:val="a9"/>
+        <w:numPr>
+          <w:ilvl w:val="0"/>
+          <w:numId w:val="3"/>
+        </w:numPr>
+      </w:pPr>
+      <w:r>
+        <w:rPr>
+          <w:rFonts w:hint="eastAsia"/>
+        </w:rPr>
+        <w:t>L</w:t>
+      </w:r>
+      <w:r>
+        <w:t>eave_request</w:t>
+      </w:r>
+    </w:p>
+    <w:tbl>
+      <w:tblPr>
+        <w:tblStyle w:val="ae"/>
+        <w:tblW w:w="0" w:type="auto"/>
+        <w:tblLook w:val="04A0" w:firstRow="1" w:lastRow="0" w:firstColumn="1" w:lastColumn="0" w:noHBand="0" w:noVBand="1"/>
+      </w:tblPr>
+      <w:tblGrid>
+        <w:gridCol w:w="2074"/>
+        <w:gridCol w:w="2074"/>
+        <w:gridCol w:w="2074"/>
+        <w:gridCol w:w="2074"/>
+      </w:tblGrid>
+      <w:tr>
+        <w:tc>
+          <w:tcPr>
+            <w:tcW w:w="2074" w:type="dxa"/>
+          </w:tcPr>
+          <w:p>
+            <w:pPr>
+              <w:rPr>
+                <w:rFonts w:hint="eastAsia"/>
+              </w:rPr>
+            </w:pPr>
+            <w:r>
+              <w:rPr>
+                <w:rFonts w:hint="eastAsia"/>
+              </w:rPr>
+              <w:t>N</w:t>
+            </w:r>
+            <w:r>
+              <w:t>o.</w:t>
+            </w:r>
+          </w:p>
+        </w:tc>
+        <w:tc>
+          <w:tcPr>
+            <w:tcW w:w="2074" w:type="dxa"/>
+          </w:tcPr>
+          <w:p>
+            <w:pPr>
+              <w:rPr>
+                <w:rFonts w:hint="eastAsia"/>
+              </w:rPr>
+            </w:pPr>
+            <w:r>
+              <w:rPr>
+                <w:rFonts w:hint="eastAsia"/>
+              </w:rPr>
+              <w:t>A</w:t>
+            </w:r>
+            <w:r>
+              <w:t>ttribute Name</w:t>
+            </w:r>
+          </w:p>
+        </w:tc>
+        <w:tc>
+          <w:tcPr>
+            <w:tcW w:w="2074" w:type="dxa"/>
+          </w:tcPr>
+          <w:p>
+            <w:pPr>
+              <w:rPr>
+                <w:rFonts w:hint="eastAsia"/>
+              </w:rPr>
+            </w:pPr>
+            <w:r>
+              <w:rPr>
+                <w:rFonts w:hint="eastAsia"/>
+              </w:rPr>
+              <w:t>T</w:t>
+            </w:r>
+            <w:r>
+              <w:t>ype</w:t>
+            </w:r>
+          </w:p>
+        </w:tc>
+        <w:tc>
+          <w:tcPr>
+            <w:tcW w:w="2074" w:type="dxa"/>
+          </w:tcPr>
+          <w:p>
+            <w:pPr>
+              <w:rPr>
+                <w:rFonts w:hint="eastAsia"/>
+              </w:rPr>
+            </w:pPr>
+            <w:r>
+              <w:rPr>
+                <w:rFonts w:hint="eastAsia"/>
+              </w:rPr>
+              <w:t>N</w:t>
+            </w:r>
+            <w:r>
+              <w:t>ote</w:t>
+            </w:r>
+          </w:p>
+        </w:tc>
+      </w:tr>
+      <w:tr>
+        <w:tc>
+          <w:tcPr>
+            <w:tcW w:w="2074" w:type="dxa"/>
+          </w:tcPr>
+          <w:p>
+            <w:pPr>
+              <w:rPr>
+                <w:rFonts w:hint="eastAsia"/>
+              </w:rPr>
+            </w:pPr>
+            <w:r>
+              <w:rPr>
+                <w:rFonts w:hint="eastAsia"/>
+              </w:rPr>
+              <w:t>1</w:t>
+            </w:r>
+          </w:p>
+        </w:tc>
+        <w:tc>
+          <w:tcPr>
+            <w:tcW w:w="2074" w:type="dxa"/>
+          </w:tcPr>
+          <w:p>
+            <w:pPr>
+              <w:rPr>
+                <w:rFonts w:hint="eastAsia"/>
+              </w:rPr>
+            </w:pPr>
+            <w:r>
+              <w:rPr>
+                <w:rFonts w:hint="eastAsia"/>
+              </w:rPr>
+              <w:t>I</w:t>
+            </w:r>
+            <w:r>
+              <w:t>d</w:t>
+            </w:r>
+          </w:p>
+        </w:tc>
+        <w:tc>
+          <w:tcPr>
+            <w:tcW w:w="2074" w:type="dxa"/>
+          </w:tcPr>
+          <w:p>
+            <w:pPr>
+              <w:rPr>
+                <w:rFonts w:hint="eastAsia"/>
+              </w:rPr>
+            </w:pPr>
+            <w:r>
+              <w:rPr>
+                <w:rFonts w:hint="eastAsia"/>
+              </w:rPr>
+              <w:t>B</w:t>
+            </w:r>
+            <w:r>
+              <w:t>IGINT</w:t>
+            </w:r>
+          </w:p>
+        </w:tc>
+        <w:tc>
+          <w:tcPr>
+            <w:tcW w:w="2074" w:type="dxa"/>
+          </w:tcPr>
+          <w:p>
+            <w:pPr>
+              <w:rPr>
+                <w:rFonts w:hint="eastAsia"/>
+              </w:rPr>
+            </w:pPr>
+            <w:r>
+              <w:t>Autoincrement</w:t>
+            </w:r>
+            <w:r>
+              <w:t>, primary key</w:t>
+            </w:r>
+          </w:p>
+        </w:tc>
+      </w:tr>
+      <w:tr>
+        <w:tc>
+          <w:tcPr>
+            <w:tcW w:w="2074" w:type="dxa"/>
+          </w:tcPr>
+          <w:p>
+            <w:pPr>
+              <w:rPr>
+                <w:rFonts w:hint="eastAsia"/>
+              </w:rPr>
+            </w:pPr>
+            <w:r>
+              <w:rPr>
+                <w:rFonts w:hint="eastAsia"/>
+              </w:rPr>
+              <w:lastRenderedPageBreak/>
+              <w:t>2</w:t>
+            </w:r>
+          </w:p>
+        </w:tc>
+        <w:tc>
+          <w:tcPr>
+            <w:tcW w:w="2074" w:type="dxa"/>
+          </w:tcPr>
+          <w:p>
+            <w:pPr>
+              <w:rPr>
+                <w:rFonts w:hint="eastAsia"/>
+              </w:rPr>
+            </w:pPr>
+            <w:r>
+              <w:t>Start_time</w:t>
+            </w:r>
+          </w:p>
+        </w:tc>
+        <w:tc>
+          <w:tcPr>
+            <w:tcW w:w="2074" w:type="dxa"/>
+          </w:tcPr>
+          <w:p>
+            <w:pPr>
+              <w:rPr>
+                <w:rFonts w:hint="eastAsia"/>
+              </w:rPr>
+            </w:pPr>
+            <w:r>
+              <w:rPr>
+                <w:rFonts w:hint="eastAsia"/>
+              </w:rPr>
+              <w:t>D</w:t>
+            </w:r>
+            <w:r>
+              <w:t>ATETIME</w:t>
+            </w:r>
+          </w:p>
+        </w:tc>
+        <w:tc>
+          <w:tcPr>
+            <w:tcW w:w="2074" w:type="dxa"/>
+          </w:tcPr>
+          <w:p>
+            <w:pPr>
+              <w:rPr>
+                <w:rFonts w:hint="eastAsia"/>
+              </w:rPr>
+            </w:pPr>
+          </w:p>
+        </w:tc>
+      </w:tr>
+      <w:tr>
+        <w:tc>
+          <w:tcPr>
+            <w:tcW w:w="2074" w:type="dxa"/>
+          </w:tcPr>
+          <w:p>
+            <w:pPr>
+              <w:rPr>
+                <w:rFonts w:hint="eastAsia"/>
+              </w:rPr>
+            </w:pPr>
+            <w:r>
+              <w:rPr>
+                <w:rFonts w:hint="eastAsia"/>
+              </w:rPr>
+              <w:t>3</w:t>
+            </w:r>
+          </w:p>
+        </w:tc>
+        <w:tc>
+          <w:tcPr>
+            <w:tcW w:w="2074" w:type="dxa"/>
+          </w:tcPr>
+          <w:p>
+            <w:pPr>
+              <w:rPr>
+                <w:rFonts w:hint="eastAsia"/>
+              </w:rPr>
+            </w:pPr>
+            <w:r>
+              <w:rPr>
+                <w:rFonts w:hint="eastAsia"/>
+              </w:rPr>
+              <w:t>E</w:t>
+            </w:r>
+            <w:r>
+              <w:t>nd_time</w:t>
+            </w:r>
+          </w:p>
+        </w:tc>
+        <w:tc>
+          <w:tcPr>
+            <w:tcW w:w="2074" w:type="dxa"/>
+          </w:tcPr>
+          <w:p>
+            <w:pPr>
+              <w:rPr>
+                <w:rFonts w:hint="eastAsia"/>
+              </w:rPr>
+            </w:pPr>
+            <w:r>
+              <w:rPr>
+                <w:rFonts w:hint="eastAsia"/>
+              </w:rPr>
+              <w:t>D</w:t>
+            </w:r>
+            <w:r>
+              <w:t>ATETIME</w:t>
+            </w:r>
+          </w:p>
+        </w:tc>
+        <w:tc>
+          <w:tcPr>
+            <w:tcW w:w="2074" w:type="dxa"/>
+          </w:tcPr>
+          <w:p>
+            <w:pPr>
+              <w:rPr>
+                <w:rFonts w:hint="eastAsia"/>
+              </w:rPr>
+            </w:pPr>
+          </w:p>
+        </w:tc>
+      </w:tr>
+    </w:tbl>
+    <w:p>
+      <w:pPr>
+        <w:rPr>
+          <w:b/>
+          <w:bCs/>
+        </w:rPr>
+      </w:pPr>
+      <w:r>
+        <w:rPr>
+          <w:rFonts w:hint="eastAsia"/>
+          <w:b/>
+          <w:bCs/>
+        </w:rPr>
+        <w:t>N</w:t>
+      </w:r>
+      <w:r>
+        <w:rPr>
+          <w:b/>
+          <w:bCs/>
+        </w:rPr>
+        <w:t>otes:</w:t>
+      </w:r>
+    </w:p>
+    <w:p>
+      <w:pPr>
+        <w:pStyle w:val="a9"/>
+        <w:numPr>
+          <w:ilvl w:val="0"/>
+          <w:numId w:val="1"/>
+        </w:numPr>
+      </w:pPr>
+      <w:r>
+        <w:t>Id increments automatically, start and end time records the date and time of start of leave and return date.</w:t>
+      </w:r>
+    </w:p>
+    <w:p/>
+    <w:p>
+      <w:pPr>
+        <w:pStyle w:val="a9"/>
+        <w:numPr>
+          <w:ilvl w:val="0"/>
+          <w:numId w:val="3"/>
+        </w:numPr>
+      </w:pPr>
+      <w:r>
+        <w:rPr>
+          <w:rFonts w:hint="eastAsia"/>
+        </w:rPr>
+        <w:t>S</w:t>
+      </w:r>
+      <w:r>
+        <w:t>wap</w:t>
+      </w:r>
+    </w:p>
+    <w:tbl>
+      <w:tblPr>
+        <w:tblStyle w:val="ae"/>
+        <w:tblW w:w="0" w:type="auto"/>
+        <w:tblLook w:val="04A0" w:firstRow="1" w:lastRow="0" w:firstColumn="1" w:lastColumn="0" w:noHBand="0" w:noVBand="1"/>
+      </w:tblPr>
+      <w:tblGrid>
+        <w:gridCol w:w="2074"/>
+        <w:gridCol w:w="2074"/>
+        <w:gridCol w:w="2074"/>
+        <w:gridCol w:w="2074"/>
+      </w:tblGrid>
+      <w:tr>
+        <w:tc>
+          <w:tcPr>
+            <w:tcW w:w="2074" w:type="dxa"/>
+          </w:tcPr>
+          <w:p>
+            <w:pPr>
+              <w:rPr>
+                <w:rFonts w:hint="eastAsia"/>
+              </w:rPr>
+            </w:pPr>
+            <w:r>
+              <w:rPr>
+                <w:rFonts w:hint="eastAsia"/>
+              </w:rPr>
+              <w:t>N</w:t>
+            </w:r>
+            <w:r>
+              <w:t xml:space="preserve">o. </w:t>
+            </w:r>
+          </w:p>
+        </w:tc>
+        <w:tc>
+          <w:tcPr>
+            <w:tcW w:w="2074" w:type="dxa"/>
+          </w:tcPr>
+          <w:p>
+            <w:pPr>
+              <w:rPr>
+                <w:rFonts w:hint="eastAsia"/>
+              </w:rPr>
+            </w:pPr>
+            <w:r>
+              <w:rPr>
+                <w:rFonts w:hint="eastAsia"/>
+              </w:rPr>
+              <w:t>A</w:t>
+            </w:r>
+            <w:r>
+              <w:t>ttribute Name</w:t>
+            </w:r>
+          </w:p>
+        </w:tc>
+        <w:tc>
+          <w:tcPr>
+            <w:tcW w:w="2074" w:type="dxa"/>
+          </w:tcPr>
+          <w:p>
+            <w:pPr>
+              <w:rPr>
+                <w:rFonts w:hint="eastAsia"/>
+              </w:rPr>
+            </w:pPr>
+            <w:r>
+              <w:rPr>
+                <w:rFonts w:hint="eastAsia"/>
+              </w:rPr>
+              <w:t>T</w:t>
+            </w:r>
+            <w:r>
+              <w:t>ype</w:t>
+            </w:r>
+          </w:p>
+        </w:tc>
+        <w:tc>
+          <w:tcPr>
+            <w:tcW w:w="2074" w:type="dxa"/>
+          </w:tcPr>
+          <w:p>
+            <w:pPr>
+              <w:rPr>
+                <w:rFonts w:hint="eastAsia"/>
+              </w:rPr>
+            </w:pPr>
+            <w:r>
+              <w:rPr>
+                <w:rFonts w:hint="eastAsia"/>
+              </w:rPr>
+              <w:t>N</w:t>
+            </w:r>
+            <w:r>
+              <w:t>ote</w:t>
+            </w:r>
+          </w:p>
+        </w:tc>
+      </w:tr>
+      <w:tr>
+        <w:tc>
+          <w:tcPr>
+            <w:tcW w:w="2074" w:type="dxa"/>
+          </w:tcPr>
+          <w:p>
+            <w:pPr>
+              <w:rPr>
+                <w:rFonts w:hint="eastAsia"/>
+              </w:rPr>
+            </w:pPr>
+            <w:r>
+              <w:rPr>
+                <w:rFonts w:hint="eastAsia"/>
+              </w:rPr>
+              <w:t>1</w:t>
+            </w:r>
+          </w:p>
+        </w:tc>
+        <w:tc>
+          <w:tcPr>
+            <w:tcW w:w="2074" w:type="dxa"/>
+          </w:tcPr>
+          <w:p>
+            <w:pPr>
+              <w:rPr>
+                <w:rFonts w:hint="eastAsia"/>
+              </w:rPr>
+            </w:pPr>
+            <w:r>
+              <w:rPr>
+                <w:rFonts w:hint="eastAsia"/>
+              </w:rPr>
+              <w:t>I</w:t>
+            </w:r>
+            <w:r>
+              <w:t>d</w:t>
+            </w:r>
+          </w:p>
+        </w:tc>
+        <w:tc>
+          <w:tcPr>
+            <w:tcW w:w="2074" w:type="dxa"/>
+          </w:tcPr>
+          <w:p>
+            <w:pPr>
+              <w:rPr>
+                <w:rFonts w:hint="eastAsia"/>
+              </w:rPr>
+            </w:pPr>
+            <w:r>
+              <w:rPr>
+                <w:rFonts w:hint="eastAsia"/>
+              </w:rPr>
+              <w:t>B</w:t>
+            </w:r>
+            <w:r>
+              <w:t>IGINT</w:t>
+            </w:r>
+          </w:p>
+        </w:tc>
+        <w:tc>
+          <w:tcPr>
+            <w:tcW w:w="2074" w:type="dxa"/>
+          </w:tcPr>
+          <w:p>
+            <w:pPr>
+              <w:rPr>
+                <w:rFonts w:hint="eastAsia"/>
+              </w:rPr>
+            </w:pPr>
+            <w:r>
+              <w:rPr>
+                <w:rFonts w:hint="eastAsia"/>
+              </w:rPr>
+              <w:t>P</w:t>
+            </w:r>
+            <w:r>
+              <w:t>rimary key autoincrement</w:t>
+            </w:r>
+          </w:p>
+        </w:tc>
+      </w:tr>
+      <w:tr>
+        <w:tc>
+          <w:tcPr>
+            <w:tcW w:w="2074" w:type="dxa"/>
+          </w:tcPr>
+          <w:p>
+            <w:pPr>
+              <w:rPr>
+                <w:rFonts w:hint="eastAsia"/>
+              </w:rPr>
+            </w:pPr>
+            <w:r>
+              <w:rPr>
+                <w:rFonts w:hint="eastAsia"/>
+              </w:rPr>
+              <w:t>2</w:t>
+            </w:r>
+          </w:p>
+        </w:tc>
+        <w:tc>
+          <w:tcPr>
+            <w:tcW w:w="2074" w:type="dxa"/>
+          </w:tcPr>
+          <w:p>
+            <w:pPr>
+              <w:rPr>
+                <w:rFonts w:hint="eastAsia"/>
+              </w:rPr>
+            </w:pPr>
+            <w:r>
+              <w:t>From</w:t>
+            </w:r>
+          </w:p>
+        </w:tc>
+        <w:tc>
+          <w:tcPr>
+            <w:tcW w:w="2074" w:type="dxa"/>
+          </w:tcPr>
+          <w:p>
+            <w:pPr>
+              <w:rPr>
+                <w:rFonts w:hint="eastAsia"/>
+              </w:rPr>
+            </w:pPr>
+            <w:r>
+              <w:rPr>
+                <w:rFonts w:hint="eastAsia"/>
+              </w:rPr>
+              <w:t>D</w:t>
+            </w:r>
+            <w:r>
+              <w:t>ATETIME</w:t>
+            </w:r>
+          </w:p>
+        </w:tc>
+        <w:tc>
+          <w:tcPr>
+            <w:tcW w:w="2074" w:type="dxa"/>
+          </w:tcPr>
+          <w:p>
+            <w:pPr>
+              <w:rPr>
+                <w:rFonts w:hint="eastAsia"/>
+              </w:rPr>
+            </w:pPr>
+            <w:r>
+              <w:t>Not null</w:t>
+            </w:r>
+          </w:p>
+        </w:tc>
+      </w:tr>
+      <w:tr>
+        <w:tc>
+          <w:tcPr>
+            <w:tcW w:w="2074" w:type="dxa"/>
+          </w:tcPr>
+          <w:p>
+            <w:pPr>
+              <w:rPr>
+                <w:rFonts w:hint="eastAsia"/>
+              </w:rPr>
+            </w:pPr>
+            <w:r>
+              <w:rPr>
+                <w:rFonts w:hint="eastAsia"/>
+              </w:rPr>
+              <w:t>3</w:t>
+            </w:r>
+          </w:p>
+        </w:tc>
+        <w:tc>
+          <w:tcPr>
+            <w:tcW w:w="2074" w:type="dxa"/>
+          </w:tcPr>
+          <w:p>
+            <w:pPr>
+              <w:rPr>
+                <w:rFonts w:hint="eastAsia"/>
+              </w:rPr>
+            </w:pPr>
+            <w:r>
+              <w:rPr>
+                <w:rFonts w:hint="eastAsia"/>
+              </w:rPr>
+              <w:t>T</w:t>
+            </w:r>
+            <w:r>
+              <w:t>o</w:t>
+            </w:r>
+          </w:p>
+        </w:tc>
+        <w:tc>
+          <w:tcPr>
+            <w:tcW w:w="2074" w:type="dxa"/>
+          </w:tcPr>
+          <w:p>
+            <w:pPr>
+              <w:rPr>
+                <w:rFonts w:hint="eastAsia"/>
+              </w:rPr>
+            </w:pPr>
+            <w:r>
+              <w:rPr>
+                <w:rFonts w:hint="eastAsia"/>
+              </w:rPr>
+              <w:t>D</w:t>
+            </w:r>
+            <w:r>
+              <w:t>ATETIME</w:t>
+            </w:r>
+          </w:p>
+        </w:tc>
+        <w:tc>
+          <w:tcPr>
+            <w:tcW w:w="2074" w:type="dxa"/>
+          </w:tcPr>
+          <w:p>
+            <w:pPr>
+              <w:rPr>
+                <w:rFonts w:hint="eastAsia"/>
+              </w:rPr>
+            </w:pPr>
+            <w:r>
+              <w:t>Not null</w:t>
+            </w:r>
+          </w:p>
+        </w:tc>
+      </w:tr>
+    </w:tbl>
+    <w:p/>
+    <w:p>
+      <w:pPr>
+        <w:pStyle w:val="a9"/>
+        <w:numPr>
+          <w:ilvl w:val="0"/>
+          <w:numId w:val="3"/>
+        </w:numPr>
+      </w:pPr>
+      <w:r>
+        <w:rPr>
+          <w:rFonts w:hint="eastAsia"/>
+        </w:rPr>
+        <w:t>O</w:t>
+      </w:r>
+      <w:r>
+        <w:t>pen_shift</w:t>
+      </w:r>
+    </w:p>
+    <w:tbl>
+      <w:tblPr>
+        <w:tblStyle w:val="ae"/>
+        <w:tblW w:w="0" w:type="auto"/>
+        <w:tblLook w:val="04A0" w:firstRow="1" w:lastRow="0" w:firstColumn="1" w:lastColumn="0" w:noHBand="0" w:noVBand="1"/>
+      </w:tblPr>
+      <w:tblGrid>
+        <w:gridCol w:w="2074"/>
+        <w:gridCol w:w="2074"/>
+        <w:gridCol w:w="2074"/>
+        <w:gridCol w:w="2074"/>
+      </w:tblGrid>
+      <w:tr>
+        <w:tc>
+          <w:tcPr>
+            <w:tcW w:w="2074" w:type="dxa"/>
+          </w:tcPr>
+          <w:p>
+            <w:pPr>
+              <w:rPr>
+                <w:rFonts w:hint="eastAsia"/>
+              </w:rPr>
+            </w:pPr>
+            <w:r>
+              <w:t>No.</w:t>
+            </w:r>
+          </w:p>
+        </w:tc>
+        <w:tc>
+          <w:tcPr>
+            <w:tcW w:w="2074" w:type="dxa"/>
+          </w:tcPr>
+          <w:p>
+            <w:pPr>
+              <w:rPr>
+                <w:rFonts w:hint="eastAsia"/>
+              </w:rPr>
+            </w:pPr>
+            <w:r>
+              <w:rPr>
+                <w:rFonts w:hint="eastAsia"/>
+              </w:rPr>
+              <w:t>A</w:t>
+            </w:r>
+            <w:r>
+              <w:t>ttribute Name</w:t>
+            </w:r>
+          </w:p>
+        </w:tc>
+        <w:tc>
+          <w:tcPr>
+            <w:tcW w:w="2074" w:type="dxa"/>
+          </w:tcPr>
+          <w:p>
+            <w:pPr>
+              <w:rPr>
+                <w:rFonts w:hint="eastAsia"/>
+              </w:rPr>
+            </w:pPr>
+            <w:r>
+              <w:rPr>
+                <w:rFonts w:hint="eastAsia"/>
+              </w:rPr>
+              <w:t>T</w:t>
+            </w:r>
+            <w:r>
+              <w:t>ype</w:t>
+            </w:r>
+          </w:p>
+        </w:tc>
+        <w:tc>
+          <w:tcPr>
+            <w:tcW w:w="2074" w:type="dxa"/>
+          </w:tcPr>
+          <w:p>
+            <w:pPr>
+              <w:rPr>
+                <w:rFonts w:hint="eastAsia"/>
+              </w:rPr>
+            </w:pPr>
+            <w:r>
+              <w:rPr>
+                <w:rFonts w:hint="eastAsia"/>
+              </w:rPr>
+              <w:t>N</w:t>
+            </w:r>
+            <w:r>
+              <w:t>ote</w:t>
+            </w:r>
+          </w:p>
+        </w:tc>
+      </w:tr>
+      <w:tr>
+        <w:tc>
+          <w:tcPr>
+            <w:tcW w:w="2074" w:type="dxa"/>
+          </w:tcPr>
+          <w:p>
+            <w:pPr>
+              <w:rPr>
+                <w:rFonts w:hint="eastAsia"/>
+              </w:rPr>
+            </w:pPr>
+            <w:r>
+              <w:rPr>
+                <w:rFonts w:hint="eastAsia"/>
+              </w:rPr>
+              <w:t>1</w:t>
+            </w:r>
+          </w:p>
+        </w:tc>
+        <w:tc>
+          <w:tcPr>
+            <w:tcW w:w="2074" w:type="dxa"/>
+          </w:tcPr>
+          <w:p>
+            <w:pPr>
+              <w:rPr>
+                <w:rFonts w:hint="eastAsia"/>
+              </w:rPr>
+            </w:pPr>
+            <w:r>
+              <w:rPr>
+                <w:rFonts w:hint="eastAsia"/>
+              </w:rPr>
+              <w:t>D</w:t>
+            </w:r>
+            <w:r>
+              <w:t>ate_made</w:t>
+            </w:r>
+          </w:p>
+        </w:tc>
+        <w:tc>
+          <w:tcPr>
+            <w:tcW w:w="2074" w:type="dxa"/>
+          </w:tcPr>
+          <w:p>
+            <w:pPr>
+              <w:rPr>
+                <w:rFonts w:hint="eastAsia"/>
+              </w:rPr>
+            </w:pPr>
+            <w:r>
+              <w:rPr>
+                <w:rFonts w:hint="eastAsia"/>
+              </w:rPr>
+              <w:t>D</w:t>
+            </w:r>
+            <w:r>
+              <w:t>ATETIME</w:t>
+            </w:r>
+          </w:p>
+        </w:tc>
+        <w:tc>
+          <w:tcPr>
+            <w:tcW w:w="2074" w:type="dxa"/>
+          </w:tcPr>
+          <w:p>
+            <w:pPr>
+              <w:rPr>
+                <w:rFonts w:hint="eastAsia"/>
+              </w:rPr>
+            </w:pPr>
+            <w:r>
+              <w:t>Not null with default being current time</w:t>
+            </w:r>
+          </w:p>
+        </w:tc>
+      </w:tr>
+    </w:tbl>
+    <w:p>
+      <w:pPr>
+        <w:rPr>
+          <w:rFonts w:hint="eastAsia"/>
+        </w:rPr>
+      </w:pPr>
     </w:p>
     <w:sectPr>
       <w:pgSz w:w="11906" w:h="16838"/>

</xml_diff>

<commit_message>
Completed reason for entity and added sample test document
</commit_message>
<xml_diff>
--- a/DataBase/doc/db design doc.docx
+++ b/DataBase/doc/db design doc.docx
@@ -36,6 +36,26 @@
           <w:rFonts w:hint="eastAsia"/>
         </w:rPr>
         <w:t>User</w:t>
+      </w:r>
+    </w:p>
+    <w:p>
+      <w:r>
+        <w:rPr>
+          <w:rFonts w:hint="eastAsia"/>
+          <w:b/>
+          <w:bCs/>
+        </w:rPr>
+        <w:t>R</w:t>
+      </w:r>
+      <w:r>
+        <w:rPr>
+          <w:b/>
+          <w:bCs/>
+        </w:rPr>
+        <w:t xml:space="preserve">eason: </w:t>
+      </w:r>
+      <w:r>
+        <w:t>User entity records all the users of we roster app, the app needs to track all its users for operations such as authentication. We need a user entity to see who are allowed to login and what operations they are allowed to do.</w:t>
       </w:r>
     </w:p>
     <w:tbl>
@@ -1082,6 +1102,26 @@
         <w:t>Staff</w:t>
       </w:r>
     </w:p>
+    <w:p>
+      <w:r>
+        <w:rPr>
+          <w:rFonts w:hint="eastAsia"/>
+          <w:b/>
+          <w:bCs/>
+        </w:rPr>
+        <w:t>R</w:t>
+      </w:r>
+      <w:r>
+        <w:rPr>
+          <w:b/>
+          <w:bCs/>
+        </w:rPr>
+        <w:t xml:space="preserve">eason: </w:t>
+      </w:r>
+      <w:r>
+        <w:t>Need a staff entity since we need to model the employees the app plans shift for, their identity and their relationships to departments and other shits. While a user is a logged in account, a staff is an employee which the app schedules.</w:t>
+      </w:r>
+    </w:p>
     <w:tbl>
       <w:tblPr>
         <w:tblStyle w:val="ae"/>
@@ -2430,6 +2470,7 @@
                 <w:sz w:val="21"/>
                 <w:szCs w:val="21"/>
               </w:rPr>
+              <w:lastRenderedPageBreak/>
               <w:t>16</w:t>
             </w:r>
           </w:p>
@@ -2679,7 +2720,6 @@
         <w:rPr>
           <w:rFonts w:hint="eastAsia"/>
         </w:rPr>
-        <w:lastRenderedPageBreak/>
         <w:t>Dept</w:t>
       </w:r>
       <w:commentRangeEnd w:id="2"/>
@@ -2688,6 +2728,26 @@
           <w:rStyle w:val="af"/>
         </w:rPr>
         <w:commentReference w:id="2"/>
+      </w:r>
+    </w:p>
+    <w:p>
+      <w:r>
+        <w:rPr>
+          <w:rFonts w:hint="eastAsia"/>
+          <w:b/>
+          <w:bCs/>
+        </w:rPr>
+        <w:t>R</w:t>
+      </w:r>
+      <w:r>
+        <w:rPr>
+          <w:b/>
+          <w:bCs/>
+        </w:rPr>
+        <w:t>eason</w:t>
+      </w:r>
+      <w:r>
+        <w:t>: We need department entity since it represents ownership of shifts, hierarchy of departments such as department sub-units. The app also needs to keep track of access control as well as employee membership.</w:t>
       </w:r>
     </w:p>
     <w:tbl>
@@ -3309,6 +3369,26 @@
         <w:commentReference w:id="4"/>
       </w:r>
     </w:p>
+    <w:p>
+      <w:r>
+        <w:rPr>
+          <w:rFonts w:hint="eastAsia"/>
+          <w:b/>
+          <w:bCs/>
+        </w:rPr>
+        <w:t>R</w:t>
+      </w:r>
+      <w:r>
+        <w:rPr>
+          <w:b/>
+          <w:bCs/>
+        </w:rPr>
+        <w:t>eason</w:t>
+      </w:r>
+      <w:r>
+        <w:t>: The app needs to keep record of schedule to a place, keep a hierarchy of locations, such as location in different hospitals.</w:t>
+      </w:r>
+    </w:p>
     <w:tbl>
       <w:tblPr>
         <w:tblStyle w:val="ae"/>
@@ -4158,6 +4238,31 @@
         <w:t>Hospital</w:t>
       </w:r>
     </w:p>
+    <w:p>
+      <w:r>
+        <w:rPr>
+          <w:rFonts w:hint="eastAsia"/>
+          <w:b/>
+          <w:bCs/>
+        </w:rPr>
+        <w:t>R</w:t>
+      </w:r>
+      <w:r>
+        <w:rPr>
+          <w:b/>
+          <w:bCs/>
+        </w:rPr>
+        <w:t>eason</w:t>
+      </w:r>
+      <w:r>
+        <w:t xml:space="preserve">: Since we roster can be applied to multiple hospitals, enclosing each hospital as a separate entity allows the app to keep track of the shift situation in individual hospitals. Each </w:t>
+      </w:r>
+      <w:r>
+        <w:lastRenderedPageBreak/>
+        <w:t>hospital is unique and has its own id.</w:t>
+      </w:r>
+    </w:p>
+    <w:p/>
     <w:tbl>
       <w:tblPr>
         <w:tblStyle w:val="ae"/>
@@ -4756,7 +4861,6 @@
         <w:rPr>
           <w:rFonts w:hint="eastAsia"/>
         </w:rPr>
-        <w:lastRenderedPageBreak/>
         <w:t>Roster_Template</w:t>
       </w:r>
       <w:commentRangeEnd w:id="7"/>
@@ -4765,6 +4869,26 @@
           <w:rStyle w:val="af"/>
         </w:rPr>
         <w:commentReference w:id="7"/>
+      </w:r>
+    </w:p>
+    <w:p>
+      <w:r>
+        <w:rPr>
+          <w:rFonts w:hint="eastAsia"/>
+          <w:b/>
+          <w:bCs/>
+        </w:rPr>
+        <w:t>R</w:t>
+      </w:r>
+      <w:r>
+        <w:rPr>
+          <w:b/>
+          <w:bCs/>
+        </w:rPr>
+        <w:t>eason</w:t>
+      </w:r>
+      <w:r>
+        <w:t>: Represents the template of a roster assignment, noting what it should include. It is a reusable pattern of rosters, speeds up scheduling and keeps rosters consistent across all staff in all hospitals.</w:t>
       </w:r>
     </w:p>
     <w:tbl>
@@ -5848,6 +5972,27 @@
         <w:t>Shift</w:t>
       </w:r>
     </w:p>
+    <w:p>
+      <w:r>
+        <w:rPr>
+          <w:rFonts w:hint="eastAsia"/>
+          <w:b/>
+          <w:bCs/>
+        </w:rPr>
+        <w:lastRenderedPageBreak/>
+        <w:t>R</w:t>
+      </w:r>
+      <w:r>
+        <w:rPr>
+          <w:b/>
+          <w:bCs/>
+        </w:rPr>
+        <w:t>eason</w:t>
+      </w:r>
+      <w:r>
+        <w:t>: Shift is a core part of we roster app, the app needs to keep track of the start time and end time of a shift for most efficient arrangement of shifts.</w:t>
+      </w:r>
+    </w:p>
     <w:tbl>
       <w:tblPr>
         <w:tblStyle w:val="ae"/>
@@ -7292,7 +7437,6 @@
           <w:b/>
           <w:bCs/>
         </w:rPr>
-        <w:lastRenderedPageBreak/>
         <w:t>Notes</w:t>
       </w:r>
     </w:p>
@@ -7410,13 +7554,7 @@
         <w:t>Typical sessions: AM, PM, OnCall (store as an enum/integer in the session field).</w:t>
       </w:r>
     </w:p>
-    <w:p>
-      <w:pPr>
-        <w:rPr>
-          <w:rFonts w:hint="eastAsia"/>
-        </w:rPr>
-      </w:pPr>
-    </w:p>
+    <w:p/>
     <w:p>
       <w:pPr>
         <w:pStyle w:val="a9"/>
@@ -7424,9 +7562,6 @@
           <w:ilvl w:val="0"/>
           <w:numId w:val="3"/>
         </w:numPr>
-        <w:rPr>
-          <w:rFonts w:hint="eastAsia"/>
-        </w:rPr>
       </w:pPr>
       <w:r>
         <w:rPr>
@@ -7442,6 +7577,18 @@
       </w:r>
       <w:r>
         <w:t>gnation</w:t>
+      </w:r>
+    </w:p>
+    <w:p>
+      <w:r>
+        <w:rPr>
+          <w:b/>
+          <w:bCs/>
+        </w:rPr>
+        <w:t>Reason</w:t>
+      </w:r>
+      <w:r>
+        <w:t>: Represents the job classification of an employee. It allows app to see the status of each staff, therefore acknowledging those who are free and those who are already assigned a shift.</w:t>
       </w:r>
     </w:p>
     <w:tbl>
@@ -7462,57 +7609,42 @@
             <w:tcW w:w="2074" w:type="dxa"/>
           </w:tcPr>
           <w:p>
-            <w:pPr>
+            <w:r>
               <w:rPr>
                 <w:rFonts w:hint="eastAsia"/>
               </w:rPr>
-            </w:pPr>
+              <w:t>N</w:t>
+            </w:r>
+            <w:r>
+              <w:t>o.</w:t>
+            </w:r>
+          </w:p>
+        </w:tc>
+        <w:tc>
+          <w:tcPr>
+            <w:tcW w:w="2074" w:type="dxa"/>
+          </w:tcPr>
+          <w:p>
             <w:r>
               <w:rPr>
                 <w:rFonts w:hint="eastAsia"/>
               </w:rPr>
-              <w:t>N</w:t>
-            </w:r>
-            <w:r>
-              <w:t>o.</w:t>
-            </w:r>
-          </w:p>
-        </w:tc>
-        <w:tc>
-          <w:tcPr>
-            <w:tcW w:w="2074" w:type="dxa"/>
-          </w:tcPr>
-          <w:p>
-            <w:pPr>
+              <w:t>A</w:t>
+            </w:r>
+            <w:r>
+              <w:t>ttribute Name</w:t>
+            </w:r>
+          </w:p>
+        </w:tc>
+        <w:tc>
+          <w:tcPr>
+            <w:tcW w:w="2074" w:type="dxa"/>
+          </w:tcPr>
+          <w:p>
+            <w:r>
               <w:rPr>
                 <w:rFonts w:hint="eastAsia"/>
               </w:rPr>
-            </w:pPr>
-            <w:r>
-              <w:rPr>
-                <w:rFonts w:hint="eastAsia"/>
-              </w:rPr>
-              <w:t>A</w:t>
-            </w:r>
-            <w:r>
-              <w:t>ttribute Name</w:t>
-            </w:r>
-          </w:p>
-        </w:tc>
-        <w:tc>
-          <w:tcPr>
-            <w:tcW w:w="2074" w:type="dxa"/>
-          </w:tcPr>
-          <w:p>
-            <w:pPr>
-              <w:rPr>
-                <w:rFonts w:hint="eastAsia"/>
-              </w:rPr>
-            </w:pPr>
-            <w:r>
-              <w:rPr>
-                <w:rFonts w:hint="eastAsia"/>
-              </w:rPr>
               <w:t>T</w:t>
             </w:r>
             <w:r>
@@ -7525,11 +7657,6 @@
             <w:tcW w:w="2074" w:type="dxa"/>
           </w:tcPr>
           <w:p>
-            <w:pPr>
-              <w:rPr>
-                <w:rFonts w:hint="eastAsia"/>
-              </w:rPr>
-            </w:pPr>
             <w:r>
               <w:rPr>
                 <w:rFonts w:hint="eastAsia"/>
@@ -7548,54 +7675,39 @@
             <w:tcW w:w="2074" w:type="dxa"/>
           </w:tcPr>
           <w:p>
-            <w:pPr>
+            <w:r>
               <w:rPr>
                 <w:rFonts w:hint="eastAsia"/>
               </w:rPr>
-            </w:pPr>
+              <w:t>1</w:t>
+            </w:r>
+          </w:p>
+        </w:tc>
+        <w:tc>
+          <w:tcPr>
+            <w:tcW w:w="2074" w:type="dxa"/>
+          </w:tcPr>
+          <w:p>
             <w:r>
               <w:rPr>
                 <w:rFonts w:hint="eastAsia"/>
               </w:rPr>
-              <w:t>1</w:t>
-            </w:r>
-          </w:p>
-        </w:tc>
-        <w:tc>
-          <w:tcPr>
-            <w:tcW w:w="2074" w:type="dxa"/>
-          </w:tcPr>
-          <w:p>
-            <w:pPr>
+              <w:t>i</w:t>
+            </w:r>
+            <w:r>
+              <w:t>d</w:t>
+            </w:r>
+          </w:p>
+        </w:tc>
+        <w:tc>
+          <w:tcPr>
+            <w:tcW w:w="2074" w:type="dxa"/>
+          </w:tcPr>
+          <w:p>
+            <w:r>
               <w:rPr>
                 <w:rFonts w:hint="eastAsia"/>
               </w:rPr>
-            </w:pPr>
-            <w:r>
-              <w:rPr>
-                <w:rFonts w:hint="eastAsia"/>
-              </w:rPr>
-              <w:t>i</w:t>
-            </w:r>
-            <w:r>
-              <w:t>d</w:t>
-            </w:r>
-          </w:p>
-        </w:tc>
-        <w:tc>
-          <w:tcPr>
-            <w:tcW w:w="2074" w:type="dxa"/>
-          </w:tcPr>
-          <w:p>
-            <w:pPr>
-              <w:rPr>
-                <w:rFonts w:hint="eastAsia"/>
-              </w:rPr>
-            </w:pPr>
-            <w:r>
-              <w:rPr>
-                <w:rFonts w:hint="eastAsia"/>
-              </w:rPr>
               <w:t>B</w:t>
             </w:r>
             <w:r>
@@ -7608,11 +7720,6 @@
             <w:tcW w:w="2074" w:type="dxa"/>
           </w:tcPr>
           <w:p>
-            <w:pPr>
-              <w:rPr>
-                <w:rFonts w:hint="eastAsia"/>
-              </w:rPr>
-            </w:pPr>
             <w:r>
               <w:rPr>
                 <w:rFonts w:hint="eastAsia"/>
@@ -7631,15 +7738,10 @@
             <w:tcW w:w="2074" w:type="dxa"/>
           </w:tcPr>
           <w:p>
-            <w:pPr>
+            <w:r>
               <w:rPr>
                 <w:rFonts w:hint="eastAsia"/>
               </w:rPr>
-            </w:pPr>
-            <w:r>
-              <w:rPr>
-                <w:rFonts w:hint="eastAsia"/>
-              </w:rPr>
               <w:t>2</w:t>
             </w:r>
           </w:p>
@@ -7649,11 +7751,6 @@
             <w:tcW w:w="2074" w:type="dxa"/>
           </w:tcPr>
           <w:p>
-            <w:pPr>
-              <w:rPr>
-                <w:rFonts w:hint="eastAsia"/>
-              </w:rPr>
-            </w:pPr>
             <w:r>
               <w:t>Name</w:t>
             </w:r>
@@ -7664,11 +7761,6 @@
             <w:tcW w:w="2074" w:type="dxa"/>
           </w:tcPr>
           <w:p>
-            <w:pPr>
-              <w:rPr>
-                <w:rFonts w:hint="eastAsia"/>
-              </w:rPr>
-            </w:pPr>
             <w:r>
               <w:rPr>
                 <w:rFonts w:hint="eastAsia"/>
@@ -7693,15 +7785,10 @@
             <w:tcW w:w="2074" w:type="dxa"/>
           </w:tcPr>
           <w:p>
-            <w:pPr>
+            <w:r>
               <w:rPr>
                 <w:rFonts w:hint="eastAsia"/>
               </w:rPr>
-            </w:pPr>
-            <w:r>
-              <w:rPr>
-                <w:rFonts w:hint="eastAsia"/>
-              </w:rPr>
               <w:t>3</w:t>
             </w:r>
           </w:p>
@@ -7711,11 +7798,6 @@
             <w:tcW w:w="2074" w:type="dxa"/>
           </w:tcPr>
           <w:p>
-            <w:pPr>
-              <w:rPr>
-                <w:rFonts w:hint="eastAsia"/>
-              </w:rPr>
-            </w:pPr>
             <w:r>
               <w:t>Code</w:t>
             </w:r>
@@ -7726,11 +7808,6 @@
             <w:tcW w:w="2074" w:type="dxa"/>
           </w:tcPr>
           <w:p>
-            <w:pPr>
-              <w:rPr>
-                <w:rFonts w:hint="eastAsia"/>
-              </w:rPr>
-            </w:pPr>
             <w:r>
               <w:rPr>
                 <w:rFonts w:hint="eastAsia"/>
@@ -7755,15 +7832,10 @@
             <w:tcW w:w="2074" w:type="dxa"/>
           </w:tcPr>
           <w:p>
-            <w:pPr>
+            <w:r>
               <w:rPr>
                 <w:rFonts w:hint="eastAsia"/>
               </w:rPr>
-            </w:pPr>
-            <w:r>
-              <w:rPr>
-                <w:rFonts w:hint="eastAsia"/>
-              </w:rPr>
               <w:t>4</w:t>
             </w:r>
           </w:p>
@@ -7773,11 +7845,6 @@
             <w:tcW w:w="2074" w:type="dxa"/>
           </w:tcPr>
           <w:p>
-            <w:pPr>
-              <w:rPr>
-                <w:rFonts w:hint="eastAsia"/>
-              </w:rPr>
-            </w:pPr>
             <w:r>
               <w:t>Matrix</w:t>
             </w:r>
@@ -7788,11 +7855,6 @@
             <w:tcW w:w="2074" w:type="dxa"/>
           </w:tcPr>
           <w:p>
-            <w:pPr>
-              <w:rPr>
-                <w:rFonts w:hint="eastAsia"/>
-              </w:rPr>
-            </w:pPr>
             <w:r>
               <w:rPr>
                 <w:rFonts w:hint="eastAsia"/>
@@ -7817,15 +7879,10 @@
             <w:tcW w:w="2074" w:type="dxa"/>
           </w:tcPr>
           <w:p>
-            <w:pPr>
+            <w:r>
               <w:rPr>
                 <w:rFonts w:hint="eastAsia"/>
               </w:rPr>
-            </w:pPr>
-            <w:r>
-              <w:rPr>
-                <w:rFonts w:hint="eastAsia"/>
-              </w:rPr>
               <w:t>5</w:t>
             </w:r>
           </w:p>
@@ -7835,11 +7892,6 @@
             <w:tcW w:w="2074" w:type="dxa"/>
           </w:tcPr>
           <w:p>
-            <w:pPr>
-              <w:rPr>
-                <w:rFonts w:hint="eastAsia"/>
-              </w:rPr>
-            </w:pPr>
             <w:r>
               <w:t>Type</w:t>
             </w:r>
@@ -7850,11 +7902,6 @@
             <w:tcW w:w="2074" w:type="dxa"/>
           </w:tcPr>
           <w:p>
-            <w:pPr>
-              <w:rPr>
-                <w:rFonts w:hint="eastAsia"/>
-              </w:rPr>
-            </w:pPr>
             <w:r>
               <w:rPr>
                 <w:rFonts w:hint="eastAsia"/>
@@ -7879,48 +7926,33 @@
             <w:tcW w:w="2074" w:type="dxa"/>
           </w:tcPr>
           <w:p>
-            <w:pPr>
+            <w:r>
               <w:rPr>
                 <w:rFonts w:hint="eastAsia"/>
               </w:rPr>
-            </w:pPr>
+              <w:t>6</w:t>
+            </w:r>
+          </w:p>
+        </w:tc>
+        <w:tc>
+          <w:tcPr>
+            <w:tcW w:w="2074" w:type="dxa"/>
+          </w:tcPr>
+          <w:p>
+            <w:r>
+              <w:t>Status</w:t>
+            </w:r>
+          </w:p>
+        </w:tc>
+        <w:tc>
+          <w:tcPr>
+            <w:tcW w:w="2074" w:type="dxa"/>
+          </w:tcPr>
+          <w:p>
             <w:r>
               <w:rPr>
                 <w:rFonts w:hint="eastAsia"/>
               </w:rPr>
-              <w:t>6</w:t>
-            </w:r>
-          </w:p>
-        </w:tc>
-        <w:tc>
-          <w:tcPr>
-            <w:tcW w:w="2074" w:type="dxa"/>
-          </w:tcPr>
-          <w:p>
-            <w:pPr>
-              <w:rPr>
-                <w:rFonts w:hint="eastAsia"/>
-              </w:rPr>
-            </w:pPr>
-            <w:r>
-              <w:t>Status</w:t>
-            </w:r>
-          </w:p>
-        </w:tc>
-        <w:tc>
-          <w:tcPr>
-            <w:tcW w:w="2074" w:type="dxa"/>
-          </w:tcPr>
-          <w:p>
-            <w:pPr>
-              <w:rPr>
-                <w:rFonts w:hint="eastAsia"/>
-              </w:rPr>
-            </w:pPr>
-            <w:r>
-              <w:rPr>
-                <w:rFonts w:hint="eastAsia"/>
-              </w:rPr>
               <w:t>V</w:t>
             </w:r>
             <w:r>
@@ -7933,11 +7965,6 @@
             <w:tcW w:w="2074" w:type="dxa"/>
           </w:tcPr>
           <w:p>
-            <w:pPr>
-              <w:rPr>
-                <w:rFonts w:hint="eastAsia"/>
-              </w:rPr>
-            </w:pPr>
             <w:r>
               <w:t>Not null, default is ‘Active’</w:t>
             </w:r>
@@ -7950,15 +7977,10 @@
             <w:tcW w:w="2074" w:type="dxa"/>
           </w:tcPr>
           <w:p>
-            <w:pPr>
+            <w:r>
               <w:rPr>
                 <w:rFonts w:hint="eastAsia"/>
               </w:rPr>
-            </w:pPr>
-            <w:r>
-              <w:rPr>
-                <w:rFonts w:hint="eastAsia"/>
-              </w:rPr>
               <w:t>7</w:t>
             </w:r>
           </w:p>
@@ -7968,11 +7990,6 @@
             <w:tcW w:w="2074" w:type="dxa"/>
           </w:tcPr>
           <w:p>
-            <w:pPr>
-              <w:rPr>
-                <w:rFonts w:hint="eastAsia"/>
-              </w:rPr>
-            </w:pPr>
             <w:r>
               <w:t>Status_time</w:t>
             </w:r>
@@ -7983,11 +8000,6 @@
             <w:tcW w:w="2074" w:type="dxa"/>
           </w:tcPr>
           <w:p>
-            <w:pPr>
-              <w:rPr>
-                <w:rFonts w:hint="eastAsia"/>
-              </w:rPr>
-            </w:pPr>
             <w:r>
               <w:rPr>
                 <w:rFonts w:hint="eastAsia"/>
@@ -8012,15 +8024,10 @@
             <w:tcW w:w="2074" w:type="dxa"/>
           </w:tcPr>
           <w:p>
-            <w:pPr>
+            <w:r>
               <w:rPr>
                 <w:rFonts w:hint="eastAsia"/>
               </w:rPr>
-            </w:pPr>
-            <w:r>
-              <w:rPr>
-                <w:rFonts w:hint="eastAsia"/>
-              </w:rPr>
               <w:t>8</w:t>
             </w:r>
           </w:p>
@@ -8030,11 +8037,6 @@
             <w:tcW w:w="2074" w:type="dxa"/>
           </w:tcPr>
           <w:p>
-            <w:pPr>
-              <w:rPr>
-                <w:rFonts w:hint="eastAsia"/>
-              </w:rPr>
-            </w:pPr>
             <w:r>
               <w:t>Accreditation</w:t>
             </w:r>
@@ -8045,11 +8047,6 @@
             <w:tcW w:w="2074" w:type="dxa"/>
           </w:tcPr>
           <w:p>
-            <w:pPr>
-              <w:rPr>
-                <w:rFonts w:hint="eastAsia"/>
-              </w:rPr>
-            </w:pPr>
             <w:r>
               <w:rPr>
                 <w:rFonts w:hint="eastAsia"/>
@@ -8074,15 +8071,10 @@
             <w:tcW w:w="2074" w:type="dxa"/>
           </w:tcPr>
           <w:p>
-            <w:pPr>
+            <w:r>
               <w:rPr>
                 <w:rFonts w:hint="eastAsia"/>
               </w:rPr>
-            </w:pPr>
-            <w:r>
-              <w:rPr>
-                <w:rFonts w:hint="eastAsia"/>
-              </w:rPr>
               <w:t>9</w:t>
             </w:r>
           </w:p>
@@ -8092,11 +8084,6 @@
             <w:tcW w:w="2074" w:type="dxa"/>
           </w:tcPr>
           <w:p>
-            <w:pPr>
-              <w:rPr>
-                <w:rFonts w:hint="eastAsia"/>
-              </w:rPr>
-            </w:pPr>
             <w:r>
               <w:t>Note</w:t>
             </w:r>
@@ -8107,11 +8094,6 @@
             <w:tcW w:w="2074" w:type="dxa"/>
           </w:tcPr>
           <w:p>
-            <w:pPr>
-              <w:rPr>
-                <w:rFonts w:hint="eastAsia"/>
-              </w:rPr>
-            </w:pPr>
             <w:r>
               <w:rPr>
                 <w:rFonts w:hint="eastAsia"/>
@@ -8136,76 +8118,60 @@
             <w:tcW w:w="2074" w:type="dxa"/>
           </w:tcPr>
           <w:p>
-            <w:pPr>
+            <w:r>
               <w:rPr>
                 <w:rFonts w:hint="eastAsia"/>
               </w:rPr>
-            </w:pPr>
+              <w:t>1</w:t>
+            </w:r>
+            <w:r>
+              <w:t>0</w:t>
+            </w:r>
+          </w:p>
+        </w:tc>
+        <w:tc>
+          <w:tcPr>
+            <w:tcW w:w="2074" w:type="dxa"/>
+          </w:tcPr>
+          <w:p>
+            <w:r>
+              <w:t>Created_time</w:t>
+            </w:r>
+          </w:p>
+        </w:tc>
+        <w:tc>
+          <w:tcPr>
+            <w:tcW w:w="2074" w:type="dxa"/>
+          </w:tcPr>
+          <w:p>
             <w:r>
               <w:rPr>
                 <w:rFonts w:hint="eastAsia"/>
               </w:rPr>
-              <w:t>1</w:t>
-            </w:r>
-            <w:r>
-              <w:t>0</w:t>
-            </w:r>
-          </w:p>
-        </w:tc>
-        <w:tc>
-          <w:tcPr>
-            <w:tcW w:w="2074" w:type="dxa"/>
-          </w:tcPr>
-          <w:p>
-            <w:pPr>
+              <w:t>D</w:t>
+            </w:r>
+            <w:r>
+              <w:t>ATETIME</w:t>
+            </w:r>
+          </w:p>
+        </w:tc>
+        <w:tc>
+          <w:tcPr>
+            <w:tcW w:w="2074" w:type="dxa"/>
+          </w:tcPr>
+          <w:p>
+            <w:r>
               <w:rPr>
                 <w:rFonts w:hint="eastAsia"/>
               </w:rPr>
-            </w:pPr>
-            <w:r>
-              <w:t>Created_time</w:t>
-            </w:r>
-          </w:p>
-        </w:tc>
-        <w:tc>
-          <w:tcPr>
-            <w:tcW w:w="2074" w:type="dxa"/>
-          </w:tcPr>
-          <w:p>
-            <w:pPr>
-              <w:rPr>
-                <w:rFonts w:hint="eastAsia"/>
-              </w:rPr>
-            </w:pPr>
-            <w:r>
-              <w:rPr>
-                <w:rFonts w:hint="eastAsia"/>
-              </w:rPr>
-              <w:t>D</w:t>
-            </w:r>
-            <w:r>
-              <w:t>ATETIME</w:t>
-            </w:r>
-          </w:p>
-        </w:tc>
-        <w:tc>
-          <w:tcPr>
-            <w:tcW w:w="2074" w:type="dxa"/>
-          </w:tcPr>
-          <w:p>
-            <w:pPr>
-              <w:rPr>
-                <w:rFonts w:hint="eastAsia"/>
-              </w:rPr>
-            </w:pPr>
-            <w:r>
-              <w:rPr>
-                <w:rFonts w:hint="eastAsia"/>
-              </w:rPr>
               <w:t>N</w:t>
             </w:r>
             <w:r>
-              <w:t>ot null, default is current time</w:t>
+              <w:t xml:space="preserve">ot null, default is </w:t>
+            </w:r>
+            <w:r>
+              <w:lastRenderedPageBreak/>
+              <w:t>current time</w:t>
             </w:r>
           </w:p>
         </w:tc>
@@ -8224,6 +8190,7 @@
           <w:b/>
           <w:bCs/>
         </w:rPr>
+        <w:lastRenderedPageBreak/>
         <w:t>N</w:t>
       </w:r>
       <w:r>
@@ -8265,13 +8232,7 @@
         <w:t xml:space="preserve"> to be changed.</w:t>
       </w:r>
     </w:p>
-    <w:p>
-      <w:pPr>
-        <w:rPr>
-          <w:rFonts w:hint="eastAsia"/>
-        </w:rPr>
-      </w:pPr>
-    </w:p>
+    <w:p/>
     <w:p>
       <w:pPr>
         <w:pStyle w:val="a9"/>
@@ -8282,6 +8243,26 @@
       </w:pPr>
       <w:r>
         <w:t>Staff_department</w:t>
+      </w:r>
+    </w:p>
+    <w:p>
+      <w:r>
+        <w:rPr>
+          <w:rFonts w:hint="eastAsia"/>
+          <w:b/>
+          <w:bCs/>
+        </w:rPr>
+        <w:t>R</w:t>
+      </w:r>
+      <w:r>
+        <w:rPr>
+          <w:b/>
+          <w:bCs/>
+        </w:rPr>
+        <w:t>eason</w:t>
+      </w:r>
+      <w:r>
+        <w:t>: It is an associative table to link staff with department, since one staff may belong to multiple departments. The many to many relationship requires such associative table.</w:t>
       </w:r>
     </w:p>
     <w:tbl>
@@ -8305,19 +8286,30 @@
             <w:tcW w:w="2097" w:type="dxa"/>
           </w:tcPr>
           <w:p>
-            <w:pPr>
+            <w:r>
               <w:rPr>
                 <w:rFonts w:hint="eastAsia"/>
               </w:rPr>
-            </w:pPr>
+              <w:t>N</w:t>
+            </w:r>
+            <w:r>
+              <w:t>o.</w:t>
+            </w:r>
+          </w:p>
+        </w:tc>
+        <w:tc>
+          <w:tcPr>
+            <w:tcW w:w="2097" w:type="dxa"/>
+          </w:tcPr>
+          <w:p>
             <w:r>
               <w:rPr>
                 <w:rFonts w:hint="eastAsia"/>
               </w:rPr>
-              <w:t>N</w:t>
-            </w:r>
-            <w:r>
-              <w:t>o.</w:t>
+              <w:t>A</w:t>
+            </w:r>
+            <w:r>
+              <w:t>ttribute Name</w:t>
             </w:r>
           </w:p>
         </w:tc>
@@ -8326,36 +8318,10 @@
             <w:tcW w:w="2097" w:type="dxa"/>
           </w:tcPr>
           <w:p>
-            <w:pPr>
+            <w:r>
               <w:rPr>
                 <w:rFonts w:hint="eastAsia"/>
               </w:rPr>
-            </w:pPr>
-            <w:r>
-              <w:rPr>
-                <w:rFonts w:hint="eastAsia"/>
-              </w:rPr>
-              <w:t>A</w:t>
-            </w:r>
-            <w:r>
-              <w:t>ttribute Name</w:t>
-            </w:r>
-          </w:p>
-        </w:tc>
-        <w:tc>
-          <w:tcPr>
-            <w:tcW w:w="2097" w:type="dxa"/>
-          </w:tcPr>
-          <w:p>
-            <w:pPr>
-              <w:rPr>
-                <w:rFonts w:hint="eastAsia"/>
-              </w:rPr>
-            </w:pPr>
-            <w:r>
-              <w:rPr>
-                <w:rFonts w:hint="eastAsia"/>
-              </w:rPr>
               <w:t>T</w:t>
             </w:r>
             <w:r>
@@ -8368,11 +8334,6 @@
             <w:tcW w:w="2098" w:type="dxa"/>
           </w:tcPr>
           <w:p>
-            <w:pPr>
-              <w:rPr>
-                <w:rFonts w:hint="eastAsia"/>
-              </w:rPr>
-            </w:pPr>
             <w:r>
               <w:rPr>
                 <w:rFonts w:hint="eastAsia"/>
@@ -8394,48 +8355,33 @@
             <w:tcW w:w="2097" w:type="dxa"/>
           </w:tcPr>
           <w:p>
-            <w:pPr>
+            <w:r>
               <w:rPr>
                 <w:rFonts w:hint="eastAsia"/>
               </w:rPr>
-            </w:pPr>
+              <w:t>1</w:t>
+            </w:r>
+          </w:p>
+        </w:tc>
+        <w:tc>
+          <w:tcPr>
+            <w:tcW w:w="2097" w:type="dxa"/>
+          </w:tcPr>
+          <w:p>
+            <w:r>
+              <w:t>Staff_id</w:t>
+            </w:r>
+          </w:p>
+        </w:tc>
+        <w:tc>
+          <w:tcPr>
+            <w:tcW w:w="2097" w:type="dxa"/>
+          </w:tcPr>
+          <w:p>
             <w:r>
               <w:rPr>
                 <w:rFonts w:hint="eastAsia"/>
               </w:rPr>
-              <w:t>1</w:t>
-            </w:r>
-          </w:p>
-        </w:tc>
-        <w:tc>
-          <w:tcPr>
-            <w:tcW w:w="2097" w:type="dxa"/>
-          </w:tcPr>
-          <w:p>
-            <w:pPr>
-              <w:rPr>
-                <w:rFonts w:hint="eastAsia"/>
-              </w:rPr>
-            </w:pPr>
-            <w:r>
-              <w:t>Staff_id</w:t>
-            </w:r>
-          </w:p>
-        </w:tc>
-        <w:tc>
-          <w:tcPr>
-            <w:tcW w:w="2097" w:type="dxa"/>
-          </w:tcPr>
-          <w:p>
-            <w:pPr>
-              <w:rPr>
-                <w:rFonts w:hint="eastAsia"/>
-              </w:rPr>
-            </w:pPr>
-            <w:r>
-              <w:rPr>
-                <w:rFonts w:hint="eastAsia"/>
-              </w:rPr>
               <w:t>B</w:t>
             </w:r>
             <w:r>
@@ -8448,11 +8394,6 @@
             <w:tcW w:w="2098" w:type="dxa"/>
           </w:tcPr>
           <w:p>
-            <w:pPr>
-              <w:rPr>
-                <w:rFonts w:hint="eastAsia"/>
-              </w:rPr>
-            </w:pPr>
             <w:r>
               <w:t>Not null, Primary key</w:t>
             </w:r>
@@ -8468,48 +8409,33 @@
             <w:tcW w:w="2097" w:type="dxa"/>
           </w:tcPr>
           <w:p>
-            <w:pPr>
+            <w:r>
               <w:rPr>
                 <w:rFonts w:hint="eastAsia"/>
               </w:rPr>
-            </w:pPr>
+              <w:t>2</w:t>
+            </w:r>
+          </w:p>
+        </w:tc>
+        <w:tc>
+          <w:tcPr>
+            <w:tcW w:w="2097" w:type="dxa"/>
+          </w:tcPr>
+          <w:p>
+            <w:r>
+              <w:t>Dept_id</w:t>
+            </w:r>
+          </w:p>
+        </w:tc>
+        <w:tc>
+          <w:tcPr>
+            <w:tcW w:w="2097" w:type="dxa"/>
+          </w:tcPr>
+          <w:p>
             <w:r>
               <w:rPr>
                 <w:rFonts w:hint="eastAsia"/>
               </w:rPr>
-              <w:t>2</w:t>
-            </w:r>
-          </w:p>
-        </w:tc>
-        <w:tc>
-          <w:tcPr>
-            <w:tcW w:w="2097" w:type="dxa"/>
-          </w:tcPr>
-          <w:p>
-            <w:pPr>
-              <w:rPr>
-                <w:rFonts w:hint="eastAsia"/>
-              </w:rPr>
-            </w:pPr>
-            <w:r>
-              <w:t>Dept_id</w:t>
-            </w:r>
-          </w:p>
-        </w:tc>
-        <w:tc>
-          <w:tcPr>
-            <w:tcW w:w="2097" w:type="dxa"/>
-          </w:tcPr>
-          <w:p>
-            <w:pPr>
-              <w:rPr>
-                <w:rFonts w:hint="eastAsia"/>
-              </w:rPr>
-            </w:pPr>
-            <w:r>
-              <w:rPr>
-                <w:rFonts w:hint="eastAsia"/>
-              </w:rPr>
               <w:t>B</w:t>
             </w:r>
             <w:r>
@@ -8522,11 +8448,6 @@
             <w:tcW w:w="2098" w:type="dxa"/>
           </w:tcPr>
           <w:p>
-            <w:pPr>
-              <w:rPr>
-                <w:rFonts w:hint="eastAsia"/>
-              </w:rPr>
-            </w:pPr>
             <w:r>
               <w:t>Not null, primary key</w:t>
             </w:r>
@@ -8542,15 +8463,10 @@
             <w:tcW w:w="2097" w:type="dxa"/>
           </w:tcPr>
           <w:p>
-            <w:pPr>
+            <w:r>
               <w:rPr>
                 <w:rFonts w:hint="eastAsia"/>
               </w:rPr>
-            </w:pPr>
-            <w:r>
-              <w:rPr>
-                <w:rFonts w:hint="eastAsia"/>
-              </w:rPr>
               <w:t>3</w:t>
             </w:r>
           </w:p>
@@ -8560,11 +8476,6 @@
             <w:tcW w:w="2097" w:type="dxa"/>
           </w:tcPr>
           <w:p>
-            <w:pPr>
-              <w:rPr>
-                <w:rFonts w:hint="eastAsia"/>
-              </w:rPr>
-            </w:pPr>
             <w:r>
               <w:t>Is_primary</w:t>
             </w:r>
@@ -8575,11 +8486,6 @@
             <w:tcW w:w="2097" w:type="dxa"/>
           </w:tcPr>
           <w:p>
-            <w:pPr>
-              <w:rPr>
-                <w:rFonts w:hint="eastAsia"/>
-              </w:rPr>
-            </w:pPr>
             <w:r>
               <w:t>Boolean</w:t>
             </w:r>
@@ -8590,11 +8496,6 @@
             <w:tcW w:w="2098" w:type="dxa"/>
           </w:tcPr>
           <w:p>
-            <w:pPr>
-              <w:rPr>
-                <w:rFonts w:hint="eastAsia"/>
-              </w:rPr>
-            </w:pPr>
             <w:r>
               <w:t>Default is false, not null</w:t>
             </w:r>
@@ -8610,48 +8511,33 @@
             <w:tcW w:w="2097" w:type="dxa"/>
           </w:tcPr>
           <w:p>
-            <w:pPr>
+            <w:r>
               <w:rPr>
                 <w:rFonts w:hint="eastAsia"/>
               </w:rPr>
-            </w:pPr>
+              <w:t>4</w:t>
+            </w:r>
+          </w:p>
+        </w:tc>
+        <w:tc>
+          <w:tcPr>
+            <w:tcW w:w="2097" w:type="dxa"/>
+          </w:tcPr>
+          <w:p>
+            <w:r>
+              <w:t>Assigned_at</w:t>
+            </w:r>
+          </w:p>
+        </w:tc>
+        <w:tc>
+          <w:tcPr>
+            <w:tcW w:w="2097" w:type="dxa"/>
+          </w:tcPr>
+          <w:p>
             <w:r>
               <w:rPr>
                 <w:rFonts w:hint="eastAsia"/>
               </w:rPr>
-              <w:t>4</w:t>
-            </w:r>
-          </w:p>
-        </w:tc>
-        <w:tc>
-          <w:tcPr>
-            <w:tcW w:w="2097" w:type="dxa"/>
-          </w:tcPr>
-          <w:p>
-            <w:pPr>
-              <w:rPr>
-                <w:rFonts w:hint="eastAsia"/>
-              </w:rPr>
-            </w:pPr>
-            <w:r>
-              <w:t>Assigned_at</w:t>
-            </w:r>
-          </w:p>
-        </w:tc>
-        <w:tc>
-          <w:tcPr>
-            <w:tcW w:w="2097" w:type="dxa"/>
-          </w:tcPr>
-          <w:p>
-            <w:pPr>
-              <w:rPr>
-                <w:rFonts w:hint="eastAsia"/>
-              </w:rPr>
-            </w:pPr>
-            <w:r>
-              <w:rPr>
-                <w:rFonts w:hint="eastAsia"/>
-              </w:rPr>
               <w:t>D</w:t>
             </w:r>
             <w:r>
@@ -8664,11 +8550,6 @@
             <w:tcW w:w="2098" w:type="dxa"/>
           </w:tcPr>
           <w:p>
-            <w:pPr>
-              <w:rPr>
-                <w:rFonts w:hint="eastAsia"/>
-              </w:rPr>
-            </w:pPr>
             <w:r>
               <w:t>Not null</w:t>
             </w:r>
@@ -8687,48 +8568,33 @@
             <w:tcW w:w="2097" w:type="dxa"/>
           </w:tcPr>
           <w:p>
-            <w:pPr>
+            <w:r>
               <w:rPr>
                 <w:rFonts w:hint="eastAsia"/>
               </w:rPr>
-            </w:pPr>
+              <w:t>5</w:t>
+            </w:r>
+          </w:p>
+        </w:tc>
+        <w:tc>
+          <w:tcPr>
+            <w:tcW w:w="2097" w:type="dxa"/>
+          </w:tcPr>
+          <w:p>
+            <w:r>
+              <w:t>Fk_sd_staff</w:t>
+            </w:r>
+          </w:p>
+        </w:tc>
+        <w:tc>
+          <w:tcPr>
+            <w:tcW w:w="2097" w:type="dxa"/>
+          </w:tcPr>
+          <w:p>
             <w:r>
               <w:rPr>
                 <w:rFonts w:hint="eastAsia"/>
               </w:rPr>
-              <w:t>5</w:t>
-            </w:r>
-          </w:p>
-        </w:tc>
-        <w:tc>
-          <w:tcPr>
-            <w:tcW w:w="2097" w:type="dxa"/>
-          </w:tcPr>
-          <w:p>
-            <w:pPr>
-              <w:rPr>
-                <w:rFonts w:hint="eastAsia"/>
-              </w:rPr>
-            </w:pPr>
-            <w:r>
-              <w:t>Fk_sd_staff</w:t>
-            </w:r>
-          </w:p>
-        </w:tc>
-        <w:tc>
-          <w:tcPr>
-            <w:tcW w:w="2097" w:type="dxa"/>
-          </w:tcPr>
-          <w:p>
-            <w:pPr>
-              <w:rPr>
-                <w:rFonts w:hint="eastAsia"/>
-              </w:rPr>
-            </w:pPr>
-            <w:r>
-              <w:rPr>
-                <w:rFonts w:hint="eastAsia"/>
-              </w:rPr>
               <w:t>B</w:t>
             </w:r>
             <w:r>
@@ -8741,11 +8607,6 @@
             <w:tcW w:w="2098" w:type="dxa"/>
           </w:tcPr>
           <w:p>
-            <w:pPr>
-              <w:rPr>
-                <w:rFonts w:hint="eastAsia"/>
-              </w:rPr>
-            </w:pPr>
             <w:r>
               <w:t>Foreign key staff_id</w:t>
             </w:r>
@@ -8761,48 +8622,33 @@
             <w:tcW w:w="2097" w:type="dxa"/>
           </w:tcPr>
           <w:p>
-            <w:pPr>
+            <w:r>
               <w:rPr>
                 <w:rFonts w:hint="eastAsia"/>
               </w:rPr>
-            </w:pPr>
+              <w:t>6</w:t>
+            </w:r>
+          </w:p>
+        </w:tc>
+        <w:tc>
+          <w:tcPr>
+            <w:tcW w:w="2097" w:type="dxa"/>
+          </w:tcPr>
+          <w:p>
+            <w:r>
+              <w:t>Fk_sd_dept</w:t>
+            </w:r>
+          </w:p>
+        </w:tc>
+        <w:tc>
+          <w:tcPr>
+            <w:tcW w:w="2097" w:type="dxa"/>
+          </w:tcPr>
+          <w:p>
             <w:r>
               <w:rPr>
                 <w:rFonts w:hint="eastAsia"/>
               </w:rPr>
-              <w:t>6</w:t>
-            </w:r>
-          </w:p>
-        </w:tc>
-        <w:tc>
-          <w:tcPr>
-            <w:tcW w:w="2097" w:type="dxa"/>
-          </w:tcPr>
-          <w:p>
-            <w:pPr>
-              <w:rPr>
-                <w:rFonts w:hint="eastAsia"/>
-              </w:rPr>
-            </w:pPr>
-            <w:r>
-              <w:t>Fk_sd_dept</w:t>
-            </w:r>
-          </w:p>
-        </w:tc>
-        <w:tc>
-          <w:tcPr>
-            <w:tcW w:w="2097" w:type="dxa"/>
-          </w:tcPr>
-          <w:p>
-            <w:pPr>
-              <w:rPr>
-                <w:rFonts w:hint="eastAsia"/>
-              </w:rPr>
-            </w:pPr>
-            <w:r>
-              <w:rPr>
-                <w:rFonts w:hint="eastAsia"/>
-              </w:rPr>
               <w:t>B</w:t>
             </w:r>
             <w:r>
@@ -8815,11 +8661,6 @@
             <w:tcW w:w="2098" w:type="dxa"/>
           </w:tcPr>
           <w:p>
-            <w:pPr>
-              <w:rPr>
-                <w:rFonts w:hint="eastAsia"/>
-              </w:rPr>
-            </w:pPr>
             <w:r>
               <w:t>Foreign key dept_id</w:t>
             </w:r>
@@ -8903,13 +8744,7 @@
         <w:t>ssigned_at marks the time which the staff is being assigned to the current department, with current time being the default value.</w:t>
       </w:r>
     </w:p>
-    <w:p>
-      <w:pPr>
-        <w:rPr>
-          <w:rFonts w:hint="eastAsia"/>
-        </w:rPr>
-      </w:pPr>
-    </w:p>
+    <w:p/>
     <w:p>
       <w:pPr>
         <w:pStyle w:val="a9"/>
@@ -8920,6 +8755,26 @@
       </w:pPr>
       <w:r>
         <w:t>Roster_template</w:t>
+      </w:r>
+    </w:p>
+    <w:p>
+      <w:r>
+        <w:rPr>
+          <w:rFonts w:hint="eastAsia"/>
+          <w:b/>
+          <w:bCs/>
+        </w:rPr>
+        <w:t>R</w:t>
+      </w:r>
+      <w:r>
+        <w:rPr>
+          <w:b/>
+          <w:bCs/>
+        </w:rPr>
+        <w:t>eason</w:t>
+      </w:r>
+      <w:r>
+        <w:t>: It is a pattern of a collection of shifts. The app needs to keep track of the status for these roster patterns to know the active roster templates that can be used.</w:t>
       </w:r>
     </w:p>
     <w:tbl>
@@ -8943,19 +8798,30 @@
             <w:tcW w:w="2097" w:type="dxa"/>
           </w:tcPr>
           <w:p>
-            <w:pPr>
+            <w:r>
               <w:rPr>
                 <w:rFonts w:hint="eastAsia"/>
               </w:rPr>
-            </w:pPr>
+              <w:t>N</w:t>
+            </w:r>
+            <w:r>
+              <w:t>o.</w:t>
+            </w:r>
+          </w:p>
+        </w:tc>
+        <w:tc>
+          <w:tcPr>
+            <w:tcW w:w="2097" w:type="dxa"/>
+          </w:tcPr>
+          <w:p>
             <w:r>
               <w:rPr>
                 <w:rFonts w:hint="eastAsia"/>
               </w:rPr>
-              <w:t>N</w:t>
-            </w:r>
-            <w:r>
-              <w:t>o.</w:t>
+              <w:t>A</w:t>
+            </w:r>
+            <w:r>
+              <w:t>ttribute Name</w:t>
             </w:r>
           </w:p>
         </w:tc>
@@ -8964,19 +8830,14 @@
             <w:tcW w:w="2097" w:type="dxa"/>
           </w:tcPr>
           <w:p>
-            <w:pPr>
+            <w:r>
               <w:rPr>
                 <w:rFonts w:hint="eastAsia"/>
               </w:rPr>
-            </w:pPr>
-            <w:r>
-              <w:rPr>
-                <w:rFonts w:hint="eastAsia"/>
-              </w:rPr>
-              <w:t>A</w:t>
-            </w:r>
-            <w:r>
-              <w:t>ttribute Name</w:t>
+              <w:t>T</w:t>
+            </w:r>
+            <w:r>
+              <w:t>ype</w:t>
             </w:r>
           </w:p>
         </w:tc>
@@ -8985,32 +8846,6 @@
             <w:tcW w:w="2097" w:type="dxa"/>
           </w:tcPr>
           <w:p>
-            <w:pPr>
-              <w:rPr>
-                <w:rFonts w:hint="eastAsia"/>
-              </w:rPr>
-            </w:pPr>
-            <w:r>
-              <w:rPr>
-                <w:rFonts w:hint="eastAsia"/>
-              </w:rPr>
-              <w:t>T</w:t>
-            </w:r>
-            <w:r>
-              <w:t>ype</w:t>
-            </w:r>
-          </w:p>
-        </w:tc>
-        <w:tc>
-          <w:tcPr>
-            <w:tcW w:w="2097" w:type="dxa"/>
-          </w:tcPr>
-          <w:p>
-            <w:pPr>
-              <w:rPr>
-                <w:rFonts w:hint="eastAsia"/>
-              </w:rPr>
-            </w:pPr>
             <w:r>
               <w:rPr>
                 <w:rFonts w:hint="eastAsia"/>
@@ -9032,17 +8867,37 @@
             <w:tcW w:w="2097" w:type="dxa"/>
           </w:tcPr>
           <w:p>
-            <w:pPr>
+            <w:r>
               <w:rPr>
                 <w:rFonts w:hint="eastAsia"/>
               </w:rPr>
-            </w:pPr>
+              <w:t>1</w:t>
+            </w:r>
+          </w:p>
+        </w:tc>
+        <w:tc>
+          <w:tcPr>
+            <w:tcW w:w="2097" w:type="dxa"/>
+          </w:tcPr>
+          <w:p>
+            <w:r>
+              <w:t>Id</w:t>
+            </w:r>
+          </w:p>
+        </w:tc>
+        <w:tc>
+          <w:tcPr>
+            <w:tcW w:w="2097" w:type="dxa"/>
+          </w:tcPr>
+          <w:p>
             <w:r>
               <w:rPr>
                 <w:rFonts w:hint="eastAsia"/>
               </w:rPr>
-              <w:lastRenderedPageBreak/>
-              <w:t>1</w:t>
+              <w:t>B</w:t>
+            </w:r>
+            <w:r>
+              <w:t>IGINT</w:t>
             </w:r>
           </w:p>
         </w:tc>
@@ -9051,47 +8906,6 @@
             <w:tcW w:w="2097" w:type="dxa"/>
           </w:tcPr>
           <w:p>
-            <w:pPr>
-              <w:rPr>
-                <w:rFonts w:hint="eastAsia"/>
-              </w:rPr>
-            </w:pPr>
-            <w:r>
-              <w:t>Id</w:t>
-            </w:r>
-          </w:p>
-        </w:tc>
-        <w:tc>
-          <w:tcPr>
-            <w:tcW w:w="2097" w:type="dxa"/>
-          </w:tcPr>
-          <w:p>
-            <w:pPr>
-              <w:rPr>
-                <w:rFonts w:hint="eastAsia"/>
-              </w:rPr>
-            </w:pPr>
-            <w:r>
-              <w:rPr>
-                <w:rFonts w:hint="eastAsia"/>
-              </w:rPr>
-              <w:t>B</w:t>
-            </w:r>
-            <w:r>
-              <w:t>IGINT</w:t>
-            </w:r>
-          </w:p>
-        </w:tc>
-        <w:tc>
-          <w:tcPr>
-            <w:tcW w:w="2097" w:type="dxa"/>
-          </w:tcPr>
-          <w:p>
-            <w:pPr>
-              <w:rPr>
-                <w:rFonts w:hint="eastAsia"/>
-              </w:rPr>
-            </w:pPr>
             <w:r>
               <w:t>Increments automatically, primary key</w:t>
             </w:r>
@@ -9107,16 +8921,37 @@
             <w:tcW w:w="2097" w:type="dxa"/>
           </w:tcPr>
           <w:p>
-            <w:pPr>
+            <w:r>
               <w:rPr>
                 <w:rFonts w:hint="eastAsia"/>
               </w:rPr>
-            </w:pPr>
+              <w:t>2</w:t>
+            </w:r>
+          </w:p>
+        </w:tc>
+        <w:tc>
+          <w:tcPr>
+            <w:tcW w:w="2097" w:type="dxa"/>
+          </w:tcPr>
+          <w:p>
+            <w:r>
+              <w:t>Status</w:t>
+            </w:r>
+          </w:p>
+        </w:tc>
+        <w:tc>
+          <w:tcPr>
+            <w:tcW w:w="2097" w:type="dxa"/>
+          </w:tcPr>
+          <w:p>
             <w:r>
               <w:rPr>
                 <w:rFonts w:hint="eastAsia"/>
               </w:rPr>
-              <w:t>2</w:t>
+              <w:t>V</w:t>
+            </w:r>
+            <w:r>
+              <w:t>ARCHAR</w:t>
             </w:r>
           </w:p>
         </w:tc>
@@ -9125,47 +8960,6 @@
             <w:tcW w:w="2097" w:type="dxa"/>
           </w:tcPr>
           <w:p>
-            <w:pPr>
-              <w:rPr>
-                <w:rFonts w:hint="eastAsia"/>
-              </w:rPr>
-            </w:pPr>
-            <w:r>
-              <w:t>Status</w:t>
-            </w:r>
-          </w:p>
-        </w:tc>
-        <w:tc>
-          <w:tcPr>
-            <w:tcW w:w="2097" w:type="dxa"/>
-          </w:tcPr>
-          <w:p>
-            <w:pPr>
-              <w:rPr>
-                <w:rFonts w:hint="eastAsia"/>
-              </w:rPr>
-            </w:pPr>
-            <w:r>
-              <w:rPr>
-                <w:rFonts w:hint="eastAsia"/>
-              </w:rPr>
-              <w:t>V</w:t>
-            </w:r>
-            <w:r>
-              <w:t>ARCHAR</w:t>
-            </w:r>
-          </w:p>
-        </w:tc>
-        <w:tc>
-          <w:tcPr>
-            <w:tcW w:w="2097" w:type="dxa"/>
-          </w:tcPr>
-          <w:p>
-            <w:pPr>
-              <w:rPr>
-                <w:rFonts w:hint="eastAsia"/>
-              </w:rPr>
-            </w:pPr>
             <w:r>
               <w:t>Default is ‘Active’</w:t>
             </w:r>
@@ -9181,16 +8975,37 @@
             <w:tcW w:w="2097" w:type="dxa"/>
           </w:tcPr>
           <w:p>
-            <w:pPr>
+            <w:r>
               <w:rPr>
                 <w:rFonts w:hint="eastAsia"/>
               </w:rPr>
-            </w:pPr>
+              <w:t>3</w:t>
+            </w:r>
+          </w:p>
+        </w:tc>
+        <w:tc>
+          <w:tcPr>
+            <w:tcW w:w="2097" w:type="dxa"/>
+          </w:tcPr>
+          <w:p>
+            <w:r>
+              <w:t>Name</w:t>
+            </w:r>
+          </w:p>
+        </w:tc>
+        <w:tc>
+          <w:tcPr>
+            <w:tcW w:w="2097" w:type="dxa"/>
+          </w:tcPr>
+          <w:p>
             <w:r>
               <w:rPr>
                 <w:rFonts w:hint="eastAsia"/>
               </w:rPr>
-              <w:t>3</w:t>
+              <w:t>V</w:t>
+            </w:r>
+            <w:r>
+              <w:t>ARCHAR</w:t>
             </w:r>
           </w:p>
         </w:tc>
@@ -9199,47 +9014,6 @@
             <w:tcW w:w="2097" w:type="dxa"/>
           </w:tcPr>
           <w:p>
-            <w:pPr>
-              <w:rPr>
-                <w:rFonts w:hint="eastAsia"/>
-              </w:rPr>
-            </w:pPr>
-            <w:r>
-              <w:t>Name</w:t>
-            </w:r>
-          </w:p>
-        </w:tc>
-        <w:tc>
-          <w:tcPr>
-            <w:tcW w:w="2097" w:type="dxa"/>
-          </w:tcPr>
-          <w:p>
-            <w:pPr>
-              <w:rPr>
-                <w:rFonts w:hint="eastAsia"/>
-              </w:rPr>
-            </w:pPr>
-            <w:r>
-              <w:rPr>
-                <w:rFonts w:hint="eastAsia"/>
-              </w:rPr>
-              <w:t>V</w:t>
-            </w:r>
-            <w:r>
-              <w:t>ARCHAR</w:t>
-            </w:r>
-          </w:p>
-        </w:tc>
-        <w:tc>
-          <w:tcPr>
-            <w:tcW w:w="2097" w:type="dxa"/>
-          </w:tcPr>
-          <w:p>
-            <w:pPr>
-              <w:rPr>
-                <w:rFonts w:hint="eastAsia"/>
-              </w:rPr>
-            </w:pPr>
             <w:r>
               <w:rPr>
                 <w:rFonts w:hint="eastAsia"/>
@@ -9261,16 +9035,27 @@
             <w:tcW w:w="2097" w:type="dxa"/>
           </w:tcPr>
           <w:p>
-            <w:pPr>
+            <w:r>
               <w:rPr>
                 <w:rFonts w:hint="eastAsia"/>
               </w:rPr>
-            </w:pPr>
+              <w:t>4</w:t>
+            </w:r>
+          </w:p>
+        </w:tc>
+        <w:tc>
+          <w:tcPr>
+            <w:tcW w:w="2097" w:type="dxa"/>
+          </w:tcPr>
+          <w:p>
             <w:r>
               <w:rPr>
                 <w:rFonts w:hint="eastAsia"/>
               </w:rPr>
-              <w:t>4</w:t>
+              <w:t>C</w:t>
+            </w:r>
+            <w:r>
+              <w:t>ode</w:t>
             </w:r>
           </w:p>
         </w:tc>
@@ -9279,19 +9064,14 @@
             <w:tcW w:w="2097" w:type="dxa"/>
           </w:tcPr>
           <w:p>
-            <w:pPr>
+            <w:r>
               <w:rPr>
                 <w:rFonts w:hint="eastAsia"/>
               </w:rPr>
-            </w:pPr>
-            <w:r>
-              <w:rPr>
-                <w:rFonts w:hint="eastAsia"/>
-              </w:rPr>
-              <w:t>C</w:t>
-            </w:r>
-            <w:r>
-              <w:t>ode</w:t>
+              <w:t>V</w:t>
+            </w:r>
+            <w:r>
+              <w:t>ARCHAR</w:t>
             </w:r>
           </w:p>
         </w:tc>
@@ -9300,32 +9080,6 @@
             <w:tcW w:w="2097" w:type="dxa"/>
           </w:tcPr>
           <w:p>
-            <w:pPr>
-              <w:rPr>
-                <w:rFonts w:hint="eastAsia"/>
-              </w:rPr>
-            </w:pPr>
-            <w:r>
-              <w:rPr>
-                <w:rFonts w:hint="eastAsia"/>
-              </w:rPr>
-              <w:t>V</w:t>
-            </w:r>
-            <w:r>
-              <w:t>ARCHAR</w:t>
-            </w:r>
-          </w:p>
-        </w:tc>
-        <w:tc>
-          <w:tcPr>
-            <w:tcW w:w="2097" w:type="dxa"/>
-          </w:tcPr>
-          <w:p>
-            <w:pPr>
-              <w:rPr>
-                <w:rFonts w:hint="eastAsia"/>
-              </w:rPr>
-            </w:pPr>
             <w:r>
               <w:rPr>
                 <w:rFonts w:hint="eastAsia"/>
@@ -9347,16 +9101,37 @@
             <w:tcW w:w="2097" w:type="dxa"/>
           </w:tcPr>
           <w:p>
-            <w:pPr>
+            <w:r>
               <w:rPr>
                 <w:rFonts w:hint="eastAsia"/>
               </w:rPr>
-            </w:pPr>
+              <w:t>5</w:t>
+            </w:r>
+          </w:p>
+        </w:tc>
+        <w:tc>
+          <w:tcPr>
+            <w:tcW w:w="2097" w:type="dxa"/>
+          </w:tcPr>
+          <w:p>
+            <w:r>
+              <w:t>Created_time</w:t>
+            </w:r>
+          </w:p>
+        </w:tc>
+        <w:tc>
+          <w:tcPr>
+            <w:tcW w:w="2097" w:type="dxa"/>
+          </w:tcPr>
+          <w:p>
             <w:r>
               <w:rPr>
                 <w:rFonts w:hint="eastAsia"/>
               </w:rPr>
-              <w:t>5</w:t>
+              <w:t>D</w:t>
+            </w:r>
+            <w:r>
+              <w:t>ATETIME</w:t>
             </w:r>
           </w:p>
         </w:tc>
@@ -9365,47 +9140,6 @@
             <w:tcW w:w="2097" w:type="dxa"/>
           </w:tcPr>
           <w:p>
-            <w:pPr>
-              <w:rPr>
-                <w:rFonts w:hint="eastAsia"/>
-              </w:rPr>
-            </w:pPr>
-            <w:r>
-              <w:t>Created_time</w:t>
-            </w:r>
-          </w:p>
-        </w:tc>
-        <w:tc>
-          <w:tcPr>
-            <w:tcW w:w="2097" w:type="dxa"/>
-          </w:tcPr>
-          <w:p>
-            <w:pPr>
-              <w:rPr>
-                <w:rFonts w:hint="eastAsia"/>
-              </w:rPr>
-            </w:pPr>
-            <w:r>
-              <w:rPr>
-                <w:rFonts w:hint="eastAsia"/>
-              </w:rPr>
-              <w:t>D</w:t>
-            </w:r>
-            <w:r>
-              <w:t>ATETIME</w:t>
-            </w:r>
-          </w:p>
-        </w:tc>
-        <w:tc>
-          <w:tcPr>
-            <w:tcW w:w="2097" w:type="dxa"/>
-          </w:tcPr>
-          <w:p>
-            <w:pPr>
-              <w:rPr>
-                <w:rFonts w:hint="eastAsia"/>
-              </w:rPr>
-            </w:pPr>
             <w:r>
               <w:t>Not null, default, current time</w:t>
             </w:r>
@@ -9421,16 +9155,27 @@
             <w:tcW w:w="2097" w:type="dxa"/>
           </w:tcPr>
           <w:p>
-            <w:pPr>
+            <w:r>
               <w:rPr>
                 <w:rFonts w:hint="eastAsia"/>
               </w:rPr>
-            </w:pPr>
+              <w:t>6</w:t>
+            </w:r>
+          </w:p>
+        </w:tc>
+        <w:tc>
+          <w:tcPr>
+            <w:tcW w:w="2097" w:type="dxa"/>
+          </w:tcPr>
+          <w:p>
             <w:r>
               <w:rPr>
                 <w:rFonts w:hint="eastAsia"/>
               </w:rPr>
-              <w:t>6</w:t>
+              <w:t>N</w:t>
+            </w:r>
+            <w:r>
+              <w:t>ote</w:t>
             </w:r>
           </w:p>
         </w:tc>
@@ -9439,19 +9184,14 @@
             <w:tcW w:w="2097" w:type="dxa"/>
           </w:tcPr>
           <w:p>
-            <w:pPr>
+            <w:r>
               <w:rPr>
                 <w:rFonts w:hint="eastAsia"/>
               </w:rPr>
-            </w:pPr>
-            <w:r>
-              <w:rPr>
-                <w:rFonts w:hint="eastAsia"/>
-              </w:rPr>
-              <w:t>N</w:t>
-            </w:r>
-            <w:r>
-              <w:t>ote</w:t>
+              <w:t>T</w:t>
+            </w:r>
+            <w:r>
+              <w:t>EXT</w:t>
             </w:r>
           </w:p>
         </w:tc>
@@ -9459,34 +9199,7 @@
           <w:tcPr>
             <w:tcW w:w="2097" w:type="dxa"/>
           </w:tcPr>
-          <w:p>
-            <w:pPr>
-              <w:rPr>
-                <w:rFonts w:hint="eastAsia"/>
-              </w:rPr>
-            </w:pPr>
-            <w:r>
-              <w:rPr>
-                <w:rFonts w:hint="eastAsia"/>
-              </w:rPr>
-              <w:t>T</w:t>
-            </w:r>
-            <w:r>
-              <w:t>EXT</w:t>
-            </w:r>
-          </w:p>
-        </w:tc>
-        <w:tc>
-          <w:tcPr>
-            <w:tcW w:w="2097" w:type="dxa"/>
-          </w:tcPr>
-          <w:p>
-            <w:pPr>
-              <w:rPr>
-                <w:rFonts w:hint="eastAsia"/>
-              </w:rPr>
-            </w:pPr>
-          </w:p>
+          <w:p/>
         </w:tc>
       </w:tr>
     </w:tbl>
@@ -9520,21 +9233,12 @@
           <w:ilvl w:val="0"/>
           <w:numId w:val="1"/>
         </w:numPr>
-        <w:rPr>
-          <w:rFonts w:hint="eastAsia"/>
-        </w:rPr>
       </w:pPr>
       <w:r>
         <w:t>Id increments automatically unless specified, if first id is 1, then second id is automatically incremented to 2.</w:t>
       </w:r>
     </w:p>
-    <w:p>
-      <w:pPr>
-        <w:rPr>
-          <w:rFonts w:hint="eastAsia"/>
-        </w:rPr>
-      </w:pPr>
-    </w:p>
+    <w:p/>
     <w:p>
       <w:pPr>
         <w:pStyle w:val="a9"/>
@@ -9551,6 +9255,26 @@
       </w:r>
       <w:r>
         <w:t>oster_template_shift</w:t>
+      </w:r>
+    </w:p>
+    <w:p>
+      <w:r>
+        <w:rPr>
+          <w:rFonts w:hint="eastAsia"/>
+          <w:b/>
+          <w:bCs/>
+        </w:rPr>
+        <w:t>R</w:t>
+      </w:r>
+      <w:r>
+        <w:rPr>
+          <w:b/>
+          <w:bCs/>
+        </w:rPr>
+        <w:t>eason</w:t>
+      </w:r>
+      <w:r>
+        <w:t>: It is an associative table between roster_template table and shift table. Since shift and roster_template has a many to many relationship.</w:t>
       </w:r>
     </w:p>
     <w:tbl>
@@ -9571,57 +9295,42 @@
             <w:tcW w:w="2074" w:type="dxa"/>
           </w:tcPr>
           <w:p>
-            <w:pPr>
+            <w:r>
               <w:rPr>
                 <w:rFonts w:hint="eastAsia"/>
               </w:rPr>
-            </w:pPr>
+              <w:t>N</w:t>
+            </w:r>
+            <w:r>
+              <w:t>o.</w:t>
+            </w:r>
+          </w:p>
+        </w:tc>
+        <w:tc>
+          <w:tcPr>
+            <w:tcW w:w="2074" w:type="dxa"/>
+          </w:tcPr>
+          <w:p>
             <w:r>
               <w:rPr>
                 <w:rFonts w:hint="eastAsia"/>
               </w:rPr>
-              <w:t>N</w:t>
-            </w:r>
-            <w:r>
-              <w:t>o.</w:t>
-            </w:r>
-          </w:p>
-        </w:tc>
-        <w:tc>
-          <w:tcPr>
-            <w:tcW w:w="2074" w:type="dxa"/>
-          </w:tcPr>
-          <w:p>
-            <w:pPr>
+              <w:t>A</w:t>
+            </w:r>
+            <w:r>
+              <w:t>ttribute Name</w:t>
+            </w:r>
+          </w:p>
+        </w:tc>
+        <w:tc>
+          <w:tcPr>
+            <w:tcW w:w="2074" w:type="dxa"/>
+          </w:tcPr>
+          <w:p>
+            <w:r>
               <w:rPr>
                 <w:rFonts w:hint="eastAsia"/>
               </w:rPr>
-            </w:pPr>
-            <w:r>
-              <w:rPr>
-                <w:rFonts w:hint="eastAsia"/>
-              </w:rPr>
-              <w:t>A</w:t>
-            </w:r>
-            <w:r>
-              <w:t>ttribute Name</w:t>
-            </w:r>
-          </w:p>
-        </w:tc>
-        <w:tc>
-          <w:tcPr>
-            <w:tcW w:w="2074" w:type="dxa"/>
-          </w:tcPr>
-          <w:p>
-            <w:pPr>
-              <w:rPr>
-                <w:rFonts w:hint="eastAsia"/>
-              </w:rPr>
-            </w:pPr>
-            <w:r>
-              <w:rPr>
-                <w:rFonts w:hint="eastAsia"/>
-              </w:rPr>
               <w:t>T</w:t>
             </w:r>
             <w:r>
@@ -9634,11 +9343,6 @@
             <w:tcW w:w="2074" w:type="dxa"/>
           </w:tcPr>
           <w:p>
-            <w:pPr>
-              <w:rPr>
-                <w:rFonts w:hint="eastAsia"/>
-              </w:rPr>
-            </w:pPr>
             <w:r>
               <w:t>Note</w:t>
             </w:r>
@@ -9651,48 +9355,34 @@
             <w:tcW w:w="2074" w:type="dxa"/>
           </w:tcPr>
           <w:p>
-            <w:pPr>
+            <w:r>
               <w:rPr>
                 <w:rFonts w:hint="eastAsia"/>
               </w:rPr>
-            </w:pPr>
+              <w:lastRenderedPageBreak/>
+              <w:t>1</w:t>
+            </w:r>
+          </w:p>
+        </w:tc>
+        <w:tc>
+          <w:tcPr>
+            <w:tcW w:w="2074" w:type="dxa"/>
+          </w:tcPr>
+          <w:p>
+            <w:r>
+              <w:t>Shift_id</w:t>
+            </w:r>
+          </w:p>
+        </w:tc>
+        <w:tc>
+          <w:tcPr>
+            <w:tcW w:w="2074" w:type="dxa"/>
+          </w:tcPr>
+          <w:p>
             <w:r>
               <w:rPr>
                 <w:rFonts w:hint="eastAsia"/>
               </w:rPr>
-              <w:t>1</w:t>
-            </w:r>
-          </w:p>
-        </w:tc>
-        <w:tc>
-          <w:tcPr>
-            <w:tcW w:w="2074" w:type="dxa"/>
-          </w:tcPr>
-          <w:p>
-            <w:pPr>
-              <w:rPr>
-                <w:rFonts w:hint="eastAsia"/>
-              </w:rPr>
-            </w:pPr>
-            <w:r>
-              <w:t>Shift_id</w:t>
-            </w:r>
-          </w:p>
-        </w:tc>
-        <w:tc>
-          <w:tcPr>
-            <w:tcW w:w="2074" w:type="dxa"/>
-          </w:tcPr>
-          <w:p>
-            <w:pPr>
-              <w:rPr>
-                <w:rFonts w:hint="eastAsia"/>
-              </w:rPr>
-            </w:pPr>
-            <w:r>
-              <w:rPr>
-                <w:rFonts w:hint="eastAsia"/>
-              </w:rPr>
               <w:t>B</w:t>
             </w:r>
             <w:r>
@@ -9705,11 +9395,6 @@
             <w:tcW w:w="2074" w:type="dxa"/>
           </w:tcPr>
           <w:p>
-            <w:pPr>
-              <w:rPr>
-                <w:rFonts w:hint="eastAsia"/>
-              </w:rPr>
-            </w:pPr>
             <w:r>
               <w:t>Not null, primary key</w:t>
             </w:r>
@@ -9722,48 +9407,33 @@
             <w:tcW w:w="2074" w:type="dxa"/>
           </w:tcPr>
           <w:p>
-            <w:pPr>
+            <w:r>
               <w:rPr>
                 <w:rFonts w:hint="eastAsia"/>
               </w:rPr>
-            </w:pPr>
+              <w:t>2</w:t>
+            </w:r>
+          </w:p>
+        </w:tc>
+        <w:tc>
+          <w:tcPr>
+            <w:tcW w:w="2074" w:type="dxa"/>
+          </w:tcPr>
+          <w:p>
+            <w:r>
+              <w:t>Template_id</w:t>
+            </w:r>
+          </w:p>
+        </w:tc>
+        <w:tc>
+          <w:tcPr>
+            <w:tcW w:w="2074" w:type="dxa"/>
+          </w:tcPr>
+          <w:p>
             <w:r>
               <w:rPr>
                 <w:rFonts w:hint="eastAsia"/>
               </w:rPr>
-              <w:t>2</w:t>
-            </w:r>
-          </w:p>
-        </w:tc>
-        <w:tc>
-          <w:tcPr>
-            <w:tcW w:w="2074" w:type="dxa"/>
-          </w:tcPr>
-          <w:p>
-            <w:pPr>
-              <w:rPr>
-                <w:rFonts w:hint="eastAsia"/>
-              </w:rPr>
-            </w:pPr>
-            <w:r>
-              <w:t>Template_id</w:t>
-            </w:r>
-          </w:p>
-        </w:tc>
-        <w:tc>
-          <w:tcPr>
-            <w:tcW w:w="2074" w:type="dxa"/>
-          </w:tcPr>
-          <w:p>
-            <w:pPr>
-              <w:rPr>
-                <w:rFonts w:hint="eastAsia"/>
-              </w:rPr>
-            </w:pPr>
-            <w:r>
-              <w:rPr>
-                <w:rFonts w:hint="eastAsia"/>
-              </w:rPr>
               <w:t>B</w:t>
             </w:r>
             <w:r>
@@ -9776,11 +9446,6 @@
             <w:tcW w:w="2074" w:type="dxa"/>
           </w:tcPr>
           <w:p>
-            <w:pPr>
-              <w:rPr>
-                <w:rFonts w:hint="eastAsia"/>
-              </w:rPr>
-            </w:pPr>
             <w:r>
               <w:t>Not null, primary key</w:t>
             </w:r>
@@ -9793,48 +9458,33 @@
             <w:tcW w:w="2074" w:type="dxa"/>
           </w:tcPr>
           <w:p>
-            <w:pPr>
+            <w:r>
               <w:rPr>
                 <w:rFonts w:hint="eastAsia"/>
               </w:rPr>
-            </w:pPr>
+              <w:t>3</w:t>
+            </w:r>
+          </w:p>
+        </w:tc>
+        <w:tc>
+          <w:tcPr>
+            <w:tcW w:w="2074" w:type="dxa"/>
+          </w:tcPr>
+          <w:p>
+            <w:r>
+              <w:t>Fk_template_rts</w:t>
+            </w:r>
+          </w:p>
+        </w:tc>
+        <w:tc>
+          <w:tcPr>
+            <w:tcW w:w="2074" w:type="dxa"/>
+          </w:tcPr>
+          <w:p>
             <w:r>
               <w:rPr>
                 <w:rFonts w:hint="eastAsia"/>
               </w:rPr>
-              <w:t>3</w:t>
-            </w:r>
-          </w:p>
-        </w:tc>
-        <w:tc>
-          <w:tcPr>
-            <w:tcW w:w="2074" w:type="dxa"/>
-          </w:tcPr>
-          <w:p>
-            <w:pPr>
-              <w:rPr>
-                <w:rFonts w:hint="eastAsia"/>
-              </w:rPr>
-            </w:pPr>
-            <w:r>
-              <w:t>Fk_template_rts</w:t>
-            </w:r>
-          </w:p>
-        </w:tc>
-        <w:tc>
-          <w:tcPr>
-            <w:tcW w:w="2074" w:type="dxa"/>
-          </w:tcPr>
-          <w:p>
-            <w:pPr>
-              <w:rPr>
-                <w:rFonts w:hint="eastAsia"/>
-              </w:rPr>
-            </w:pPr>
-            <w:r>
-              <w:rPr>
-                <w:rFonts w:hint="eastAsia"/>
-              </w:rPr>
               <w:t>B</w:t>
             </w:r>
             <w:r>
@@ -9847,11 +9497,6 @@
             <w:tcW w:w="2074" w:type="dxa"/>
           </w:tcPr>
           <w:p>
-            <w:pPr>
-              <w:rPr>
-                <w:rFonts w:hint="eastAsia"/>
-              </w:rPr>
-            </w:pPr>
             <w:r>
               <w:t>Foreign key template_id</w:t>
             </w:r>
@@ -9864,48 +9509,33 @@
             <w:tcW w:w="2074" w:type="dxa"/>
           </w:tcPr>
           <w:p>
-            <w:pPr>
+            <w:r>
               <w:rPr>
                 <w:rFonts w:hint="eastAsia"/>
               </w:rPr>
-            </w:pPr>
+              <w:t>4</w:t>
+            </w:r>
+          </w:p>
+        </w:tc>
+        <w:tc>
+          <w:tcPr>
+            <w:tcW w:w="2074" w:type="dxa"/>
+          </w:tcPr>
+          <w:p>
+            <w:r>
+              <w:t>Fk_shift_rts</w:t>
+            </w:r>
+          </w:p>
+        </w:tc>
+        <w:tc>
+          <w:tcPr>
+            <w:tcW w:w="2074" w:type="dxa"/>
+          </w:tcPr>
+          <w:p>
             <w:r>
               <w:rPr>
                 <w:rFonts w:hint="eastAsia"/>
               </w:rPr>
-              <w:t>4</w:t>
-            </w:r>
-          </w:p>
-        </w:tc>
-        <w:tc>
-          <w:tcPr>
-            <w:tcW w:w="2074" w:type="dxa"/>
-          </w:tcPr>
-          <w:p>
-            <w:pPr>
-              <w:rPr>
-                <w:rFonts w:hint="eastAsia"/>
-              </w:rPr>
-            </w:pPr>
-            <w:r>
-              <w:t>Fk_shift_rts</w:t>
-            </w:r>
-          </w:p>
-        </w:tc>
-        <w:tc>
-          <w:tcPr>
-            <w:tcW w:w="2074" w:type="dxa"/>
-          </w:tcPr>
-          <w:p>
-            <w:pPr>
-              <w:rPr>
-                <w:rFonts w:hint="eastAsia"/>
-              </w:rPr>
-            </w:pPr>
-            <w:r>
-              <w:rPr>
-                <w:rFonts w:hint="eastAsia"/>
-              </w:rPr>
               <w:t>B</w:t>
             </w:r>
             <w:r>
@@ -9918,11 +9548,6 @@
             <w:tcW w:w="2074" w:type="dxa"/>
           </w:tcPr>
           <w:p>
-            <w:pPr>
-              <w:rPr>
-                <w:rFonts w:hint="eastAsia"/>
-              </w:rPr>
-            </w:pPr>
             <w:r>
               <w:t>Foreign key shift_id</w:t>
             </w:r>
@@ -9968,13 +9593,7 @@
         <w:t>.</w:t>
       </w:r>
     </w:p>
-    <w:p>
-      <w:pPr>
-        <w:rPr>
-          <w:rFonts w:hint="eastAsia"/>
-        </w:rPr>
-      </w:pPr>
-    </w:p>
+    <w:p/>
     <w:p>
       <w:pPr>
         <w:pStyle w:val="a9"/>
@@ -9985,6 +9604,26 @@
       </w:pPr>
       <w:r>
         <w:t>Shift_assignment</w:t>
+      </w:r>
+    </w:p>
+    <w:p>
+      <w:r>
+        <w:rPr>
+          <w:rFonts w:hint="eastAsia"/>
+          <w:b/>
+          <w:bCs/>
+        </w:rPr>
+        <w:t>R</w:t>
+      </w:r>
+      <w:r>
+        <w:rPr>
+          <w:b/>
+          <w:bCs/>
+        </w:rPr>
+        <w:t>eason</w:t>
+      </w:r>
+      <w:r>
+        <w:t xml:space="preserve">: The app needs this entity to build the roster per staff, keeping track of the employee in charge of this shift. The note section can be used to store why the person is assigned and other miscellaneous things. </w:t>
       </w:r>
     </w:p>
     <w:tbl>
@@ -10005,57 +9644,42 @@
             <w:tcW w:w="2074" w:type="dxa"/>
           </w:tcPr>
           <w:p>
-            <w:pPr>
+            <w:r>
               <w:rPr>
                 <w:rFonts w:hint="eastAsia"/>
               </w:rPr>
-            </w:pPr>
+              <w:t>N</w:t>
+            </w:r>
+            <w:r>
+              <w:t>o.</w:t>
+            </w:r>
+          </w:p>
+        </w:tc>
+        <w:tc>
+          <w:tcPr>
+            <w:tcW w:w="2074" w:type="dxa"/>
+          </w:tcPr>
+          <w:p>
             <w:r>
               <w:rPr>
                 <w:rFonts w:hint="eastAsia"/>
               </w:rPr>
-              <w:t>N</w:t>
-            </w:r>
-            <w:r>
-              <w:t>o.</w:t>
-            </w:r>
-          </w:p>
-        </w:tc>
-        <w:tc>
-          <w:tcPr>
-            <w:tcW w:w="2074" w:type="dxa"/>
-          </w:tcPr>
-          <w:p>
-            <w:pPr>
+              <w:t>A</w:t>
+            </w:r>
+            <w:r>
+              <w:t>ttribute Name</w:t>
+            </w:r>
+          </w:p>
+        </w:tc>
+        <w:tc>
+          <w:tcPr>
+            <w:tcW w:w="2074" w:type="dxa"/>
+          </w:tcPr>
+          <w:p>
+            <w:r>
               <w:rPr>
                 <w:rFonts w:hint="eastAsia"/>
               </w:rPr>
-            </w:pPr>
-            <w:r>
-              <w:rPr>
-                <w:rFonts w:hint="eastAsia"/>
-              </w:rPr>
-              <w:t>A</w:t>
-            </w:r>
-            <w:r>
-              <w:t>ttribute Name</w:t>
-            </w:r>
-          </w:p>
-        </w:tc>
-        <w:tc>
-          <w:tcPr>
-            <w:tcW w:w="2074" w:type="dxa"/>
-          </w:tcPr>
-          <w:p>
-            <w:pPr>
-              <w:rPr>
-                <w:rFonts w:hint="eastAsia"/>
-              </w:rPr>
-            </w:pPr>
-            <w:r>
-              <w:rPr>
-                <w:rFonts w:hint="eastAsia"/>
-              </w:rPr>
               <w:t>T</w:t>
             </w:r>
             <w:r>
@@ -10068,11 +9692,6 @@
             <w:tcW w:w="2074" w:type="dxa"/>
           </w:tcPr>
           <w:p>
-            <w:pPr>
-              <w:rPr>
-                <w:rFonts w:hint="eastAsia"/>
-              </w:rPr>
-            </w:pPr>
             <w:r>
               <w:t>Note</w:t>
             </w:r>
@@ -10085,48 +9704,33 @@
             <w:tcW w:w="2074" w:type="dxa"/>
           </w:tcPr>
           <w:p>
-            <w:pPr>
+            <w:r>
               <w:rPr>
                 <w:rFonts w:hint="eastAsia"/>
               </w:rPr>
-            </w:pPr>
+              <w:t>1</w:t>
+            </w:r>
+          </w:p>
+        </w:tc>
+        <w:tc>
+          <w:tcPr>
+            <w:tcW w:w="2074" w:type="dxa"/>
+          </w:tcPr>
+          <w:p>
+            <w:r>
+              <w:t>Id</w:t>
+            </w:r>
+          </w:p>
+        </w:tc>
+        <w:tc>
+          <w:tcPr>
+            <w:tcW w:w="2074" w:type="dxa"/>
+          </w:tcPr>
+          <w:p>
             <w:r>
               <w:rPr>
                 <w:rFonts w:hint="eastAsia"/>
               </w:rPr>
-              <w:t>1</w:t>
-            </w:r>
-          </w:p>
-        </w:tc>
-        <w:tc>
-          <w:tcPr>
-            <w:tcW w:w="2074" w:type="dxa"/>
-          </w:tcPr>
-          <w:p>
-            <w:pPr>
-              <w:rPr>
-                <w:rFonts w:hint="eastAsia"/>
-              </w:rPr>
-            </w:pPr>
-            <w:r>
-              <w:t>Id</w:t>
-            </w:r>
-          </w:p>
-        </w:tc>
-        <w:tc>
-          <w:tcPr>
-            <w:tcW w:w="2074" w:type="dxa"/>
-          </w:tcPr>
-          <w:p>
-            <w:pPr>
-              <w:rPr>
-                <w:rFonts w:hint="eastAsia"/>
-              </w:rPr>
-            </w:pPr>
-            <w:r>
-              <w:rPr>
-                <w:rFonts w:hint="eastAsia"/>
-              </w:rPr>
               <w:t>B</w:t>
             </w:r>
             <w:r>
@@ -10139,11 +9743,6 @@
             <w:tcW w:w="2074" w:type="dxa"/>
           </w:tcPr>
           <w:p>
-            <w:pPr>
-              <w:rPr>
-                <w:rFonts w:hint="eastAsia"/>
-              </w:rPr>
-            </w:pPr>
             <w:r>
               <w:rPr>
                 <w:rFonts w:hint="eastAsia"/>
@@ -10162,48 +9761,33 @@
             <w:tcW w:w="2074" w:type="dxa"/>
           </w:tcPr>
           <w:p>
-            <w:pPr>
+            <w:r>
               <w:rPr>
                 <w:rFonts w:hint="eastAsia"/>
               </w:rPr>
-            </w:pPr>
+              <w:t>2</w:t>
+            </w:r>
+          </w:p>
+        </w:tc>
+        <w:tc>
+          <w:tcPr>
+            <w:tcW w:w="2074" w:type="dxa"/>
+          </w:tcPr>
+          <w:p>
+            <w:r>
+              <w:t>Staff_id</w:t>
+            </w:r>
+          </w:p>
+        </w:tc>
+        <w:tc>
+          <w:tcPr>
+            <w:tcW w:w="2074" w:type="dxa"/>
+          </w:tcPr>
+          <w:p>
             <w:r>
               <w:rPr>
                 <w:rFonts w:hint="eastAsia"/>
               </w:rPr>
-              <w:t>2</w:t>
-            </w:r>
-          </w:p>
-        </w:tc>
-        <w:tc>
-          <w:tcPr>
-            <w:tcW w:w="2074" w:type="dxa"/>
-          </w:tcPr>
-          <w:p>
-            <w:pPr>
-              <w:rPr>
-                <w:rFonts w:hint="eastAsia"/>
-              </w:rPr>
-            </w:pPr>
-            <w:r>
-              <w:t>Staff_id</w:t>
-            </w:r>
-          </w:p>
-        </w:tc>
-        <w:tc>
-          <w:tcPr>
-            <w:tcW w:w="2074" w:type="dxa"/>
-          </w:tcPr>
-          <w:p>
-            <w:pPr>
-              <w:rPr>
-                <w:rFonts w:hint="eastAsia"/>
-              </w:rPr>
-            </w:pPr>
-            <w:r>
-              <w:rPr>
-                <w:rFonts w:hint="eastAsia"/>
-              </w:rPr>
               <w:t>B</w:t>
             </w:r>
             <w:r>
@@ -10216,11 +9800,6 @@
             <w:tcW w:w="2074" w:type="dxa"/>
           </w:tcPr>
           <w:p>
-            <w:pPr>
-              <w:rPr>
-                <w:rFonts w:hint="eastAsia"/>
-              </w:rPr>
-            </w:pPr>
             <w:r>
               <w:rPr>
                 <w:rFonts w:hint="eastAsia"/>
@@ -10242,48 +9821,33 @@
             <w:tcW w:w="2074" w:type="dxa"/>
           </w:tcPr>
           <w:p>
-            <w:pPr>
+            <w:r>
               <w:rPr>
                 <w:rFonts w:hint="eastAsia"/>
               </w:rPr>
-            </w:pPr>
+              <w:t>3</w:t>
+            </w:r>
+          </w:p>
+        </w:tc>
+        <w:tc>
+          <w:tcPr>
+            <w:tcW w:w="2074" w:type="dxa"/>
+          </w:tcPr>
+          <w:p>
+            <w:r>
+              <w:t>Shift_id</w:t>
+            </w:r>
+          </w:p>
+        </w:tc>
+        <w:tc>
+          <w:tcPr>
+            <w:tcW w:w="2074" w:type="dxa"/>
+          </w:tcPr>
+          <w:p>
             <w:r>
               <w:rPr>
                 <w:rFonts w:hint="eastAsia"/>
               </w:rPr>
-              <w:t>3</w:t>
-            </w:r>
-          </w:p>
-        </w:tc>
-        <w:tc>
-          <w:tcPr>
-            <w:tcW w:w="2074" w:type="dxa"/>
-          </w:tcPr>
-          <w:p>
-            <w:pPr>
-              <w:rPr>
-                <w:rFonts w:hint="eastAsia"/>
-              </w:rPr>
-            </w:pPr>
-            <w:r>
-              <w:t>Shift_id</w:t>
-            </w:r>
-          </w:p>
-        </w:tc>
-        <w:tc>
-          <w:tcPr>
-            <w:tcW w:w="2074" w:type="dxa"/>
-          </w:tcPr>
-          <w:p>
-            <w:pPr>
-              <w:rPr>
-                <w:rFonts w:hint="eastAsia"/>
-              </w:rPr>
-            </w:pPr>
-            <w:r>
-              <w:rPr>
-                <w:rFonts w:hint="eastAsia"/>
-              </w:rPr>
               <w:t>B</w:t>
             </w:r>
             <w:r>
@@ -10296,11 +9860,6 @@
             <w:tcW w:w="2074" w:type="dxa"/>
           </w:tcPr>
           <w:p>
-            <w:pPr>
-              <w:rPr>
-                <w:rFonts w:hint="eastAsia"/>
-              </w:rPr>
-            </w:pPr>
             <w:r>
               <w:rPr>
                 <w:rFonts w:hint="eastAsia"/>
@@ -10322,15 +9881,10 @@
             <w:tcW w:w="2074" w:type="dxa"/>
           </w:tcPr>
           <w:p>
-            <w:pPr>
+            <w:r>
               <w:rPr>
                 <w:rFonts w:hint="eastAsia"/>
               </w:rPr>
-            </w:pPr>
-            <w:r>
-              <w:rPr>
-                <w:rFonts w:hint="eastAsia"/>
-              </w:rPr>
               <w:t>4</w:t>
             </w:r>
           </w:p>
@@ -10340,11 +9894,6 @@
             <w:tcW w:w="2074" w:type="dxa"/>
           </w:tcPr>
           <w:p>
-            <w:pPr>
-              <w:rPr>
-                <w:rFonts w:hint="eastAsia"/>
-              </w:rPr>
-            </w:pPr>
             <w:r>
               <w:t>Is_lead</w:t>
             </w:r>
@@ -10355,11 +9904,6 @@
             <w:tcW w:w="2074" w:type="dxa"/>
           </w:tcPr>
           <w:p>
-            <w:pPr>
-              <w:rPr>
-                <w:rFonts w:hint="eastAsia"/>
-              </w:rPr>
-            </w:pPr>
             <w:r>
               <w:t>Boolean</w:t>
             </w:r>
@@ -10370,11 +9914,6 @@
             <w:tcW w:w="2074" w:type="dxa"/>
           </w:tcPr>
           <w:p>
-            <w:pPr>
-              <w:rPr>
-                <w:rFonts w:hint="eastAsia"/>
-              </w:rPr>
-            </w:pPr>
             <w:r>
               <w:t>Not null, default is false</w:t>
             </w:r>
@@ -10387,54 +9926,39 @@
             <w:tcW w:w="2074" w:type="dxa"/>
           </w:tcPr>
           <w:p>
-            <w:pPr>
+            <w:r>
               <w:rPr>
                 <w:rFonts w:hint="eastAsia"/>
               </w:rPr>
-            </w:pPr>
+              <w:t>5</w:t>
+            </w:r>
+          </w:p>
+        </w:tc>
+        <w:tc>
+          <w:tcPr>
+            <w:tcW w:w="2074" w:type="dxa"/>
+          </w:tcPr>
+          <w:p>
             <w:r>
               <w:rPr>
                 <w:rFonts w:hint="eastAsia"/>
               </w:rPr>
-              <w:t>5</w:t>
-            </w:r>
-          </w:p>
-        </w:tc>
-        <w:tc>
-          <w:tcPr>
-            <w:tcW w:w="2074" w:type="dxa"/>
-          </w:tcPr>
-          <w:p>
-            <w:pPr>
+              <w:t>A</w:t>
+            </w:r>
+            <w:r>
+              <w:t>ssigned_at</w:t>
+            </w:r>
+          </w:p>
+        </w:tc>
+        <w:tc>
+          <w:tcPr>
+            <w:tcW w:w="2074" w:type="dxa"/>
+          </w:tcPr>
+          <w:p>
+            <w:r>
               <w:rPr>
                 <w:rFonts w:hint="eastAsia"/>
               </w:rPr>
-            </w:pPr>
-            <w:r>
-              <w:rPr>
-                <w:rFonts w:hint="eastAsia"/>
-              </w:rPr>
-              <w:t>A</w:t>
-            </w:r>
-            <w:r>
-              <w:t>ssigned_at</w:t>
-            </w:r>
-          </w:p>
-        </w:tc>
-        <w:tc>
-          <w:tcPr>
-            <w:tcW w:w="2074" w:type="dxa"/>
-          </w:tcPr>
-          <w:p>
-            <w:pPr>
-              <w:rPr>
-                <w:rFonts w:hint="eastAsia"/>
-              </w:rPr>
-            </w:pPr>
-            <w:r>
-              <w:rPr>
-                <w:rFonts w:hint="eastAsia"/>
-              </w:rPr>
               <w:t>D</w:t>
             </w:r>
             <w:r>
@@ -10447,11 +9971,6 @@
             <w:tcW w:w="2074" w:type="dxa"/>
           </w:tcPr>
           <w:p>
-            <w:pPr>
-              <w:rPr>
-                <w:rFonts w:hint="eastAsia"/>
-              </w:rPr>
-            </w:pPr>
             <w:r>
               <w:rPr>
                 <w:rFonts w:hint="eastAsia"/>
@@ -10473,15 +9992,10 @@
             <w:tcW w:w="2074" w:type="dxa"/>
           </w:tcPr>
           <w:p>
-            <w:pPr>
+            <w:r>
               <w:rPr>
                 <w:rFonts w:hint="eastAsia"/>
               </w:rPr>
-            </w:pPr>
-            <w:r>
-              <w:rPr>
-                <w:rFonts w:hint="eastAsia"/>
-              </w:rPr>
               <w:t>6</w:t>
             </w:r>
           </w:p>
@@ -10491,11 +10005,6 @@
             <w:tcW w:w="2074" w:type="dxa"/>
           </w:tcPr>
           <w:p>
-            <w:pPr>
-              <w:rPr>
-                <w:rFonts w:hint="eastAsia"/>
-              </w:rPr>
-            </w:pPr>
             <w:r>
               <w:t>Note</w:t>
             </w:r>
@@ -10506,11 +10015,6 @@
             <w:tcW w:w="2074" w:type="dxa"/>
           </w:tcPr>
           <w:p>
-            <w:pPr>
-              <w:rPr>
-                <w:rFonts w:hint="eastAsia"/>
-              </w:rPr>
-            </w:pPr>
             <w:r>
               <w:t xml:space="preserve">Text </w:t>
             </w:r>
@@ -10520,13 +10024,7 @@
           <w:tcPr>
             <w:tcW w:w="2074" w:type="dxa"/>
           </w:tcPr>
-          <w:p>
-            <w:pPr>
-              <w:rPr>
-                <w:rFonts w:hint="eastAsia"/>
-              </w:rPr>
-            </w:pPr>
-          </w:p>
+          <w:p/>
         </w:tc>
       </w:tr>
       <w:tr>
@@ -10535,48 +10033,33 @@
             <w:tcW w:w="2074" w:type="dxa"/>
           </w:tcPr>
           <w:p>
-            <w:pPr>
+            <w:r>
               <w:rPr>
                 <w:rFonts w:hint="eastAsia"/>
               </w:rPr>
-            </w:pPr>
+              <w:t>7</w:t>
+            </w:r>
+          </w:p>
+        </w:tc>
+        <w:tc>
+          <w:tcPr>
+            <w:tcW w:w="2074" w:type="dxa"/>
+          </w:tcPr>
+          <w:p>
+            <w:r>
+              <w:t>Fk_staff_sa</w:t>
+            </w:r>
+          </w:p>
+        </w:tc>
+        <w:tc>
+          <w:tcPr>
+            <w:tcW w:w="2074" w:type="dxa"/>
+          </w:tcPr>
+          <w:p>
             <w:r>
               <w:rPr>
                 <w:rFonts w:hint="eastAsia"/>
               </w:rPr>
-              <w:t>7</w:t>
-            </w:r>
-          </w:p>
-        </w:tc>
-        <w:tc>
-          <w:tcPr>
-            <w:tcW w:w="2074" w:type="dxa"/>
-          </w:tcPr>
-          <w:p>
-            <w:pPr>
-              <w:rPr>
-                <w:rFonts w:hint="eastAsia"/>
-              </w:rPr>
-            </w:pPr>
-            <w:r>
-              <w:t>Fk_staff_sa</w:t>
-            </w:r>
-          </w:p>
-        </w:tc>
-        <w:tc>
-          <w:tcPr>
-            <w:tcW w:w="2074" w:type="dxa"/>
-          </w:tcPr>
-          <w:p>
-            <w:pPr>
-              <w:rPr>
-                <w:rFonts w:hint="eastAsia"/>
-              </w:rPr>
-            </w:pPr>
-            <w:r>
-              <w:rPr>
-                <w:rFonts w:hint="eastAsia"/>
-              </w:rPr>
               <w:t>B</w:t>
             </w:r>
             <w:r>
@@ -10589,11 +10072,6 @@
             <w:tcW w:w="2074" w:type="dxa"/>
           </w:tcPr>
           <w:p>
-            <w:pPr>
-              <w:rPr>
-                <w:rFonts w:hint="eastAsia"/>
-              </w:rPr>
-            </w:pPr>
             <w:r>
               <w:rPr>
                 <w:rFonts w:hint="eastAsia"/>
@@ -10612,48 +10090,33 @@
             <w:tcW w:w="2074" w:type="dxa"/>
           </w:tcPr>
           <w:p>
-            <w:pPr>
+            <w:r>
               <w:rPr>
                 <w:rFonts w:hint="eastAsia"/>
               </w:rPr>
-            </w:pPr>
+              <w:t>8</w:t>
+            </w:r>
+          </w:p>
+        </w:tc>
+        <w:tc>
+          <w:tcPr>
+            <w:tcW w:w="2074" w:type="dxa"/>
+          </w:tcPr>
+          <w:p>
+            <w:r>
+              <w:t>Fk_shift_sa</w:t>
+            </w:r>
+          </w:p>
+        </w:tc>
+        <w:tc>
+          <w:tcPr>
+            <w:tcW w:w="2074" w:type="dxa"/>
+          </w:tcPr>
+          <w:p>
             <w:r>
               <w:rPr>
                 <w:rFonts w:hint="eastAsia"/>
               </w:rPr>
-              <w:t>8</w:t>
-            </w:r>
-          </w:p>
-        </w:tc>
-        <w:tc>
-          <w:tcPr>
-            <w:tcW w:w="2074" w:type="dxa"/>
-          </w:tcPr>
-          <w:p>
-            <w:pPr>
-              <w:rPr>
-                <w:rFonts w:hint="eastAsia"/>
-              </w:rPr>
-            </w:pPr>
-            <w:r>
-              <w:t>Fk_shift_sa</w:t>
-            </w:r>
-          </w:p>
-        </w:tc>
-        <w:tc>
-          <w:tcPr>
-            <w:tcW w:w="2074" w:type="dxa"/>
-          </w:tcPr>
-          <w:p>
-            <w:pPr>
-              <w:rPr>
-                <w:rFonts w:hint="eastAsia"/>
-              </w:rPr>
-            </w:pPr>
-            <w:r>
-              <w:rPr>
-                <w:rFonts w:hint="eastAsia"/>
-              </w:rPr>
               <w:t>B</w:t>
             </w:r>
             <w:r>
@@ -10666,11 +10129,6 @@
             <w:tcW w:w="2074" w:type="dxa"/>
           </w:tcPr>
           <w:p>
-            <w:pPr>
-              <w:rPr>
-                <w:rFonts w:hint="eastAsia"/>
-              </w:rPr>
-            </w:pPr>
             <w:r>
               <w:t>Foreign key shift_id</w:t>
             </w:r>
@@ -10739,6 +10197,26 @@
       </w:r>
       <w:r>
         <w:t>eave_request</w:t>
+      </w:r>
+    </w:p>
+    <w:p>
+      <w:r>
+        <w:rPr>
+          <w:rFonts w:hint="eastAsia"/>
+          <w:b/>
+          <w:bCs/>
+        </w:rPr>
+        <w:t>R</w:t>
+      </w:r>
+      <w:r>
+        <w:rPr>
+          <w:b/>
+          <w:bCs/>
+        </w:rPr>
+        <w:t>eason</w:t>
+      </w:r>
+      <w:r>
+        <w:t>: The app needs to track leave requests of staff members, keeping track of the start of their leave and when they return to work, so the system knows to avoid assigning shifts to staff who are away.</w:t>
       </w:r>
     </w:p>
     <w:tbl>
@@ -10759,57 +10237,42 @@
             <w:tcW w:w="2074" w:type="dxa"/>
           </w:tcPr>
           <w:p>
-            <w:pPr>
+            <w:r>
               <w:rPr>
                 <w:rFonts w:hint="eastAsia"/>
               </w:rPr>
-            </w:pPr>
+              <w:t>N</w:t>
+            </w:r>
+            <w:r>
+              <w:t>o.</w:t>
+            </w:r>
+          </w:p>
+        </w:tc>
+        <w:tc>
+          <w:tcPr>
+            <w:tcW w:w="2074" w:type="dxa"/>
+          </w:tcPr>
+          <w:p>
             <w:r>
               <w:rPr>
                 <w:rFonts w:hint="eastAsia"/>
               </w:rPr>
-              <w:t>N</w:t>
-            </w:r>
-            <w:r>
-              <w:t>o.</w:t>
-            </w:r>
-          </w:p>
-        </w:tc>
-        <w:tc>
-          <w:tcPr>
-            <w:tcW w:w="2074" w:type="dxa"/>
-          </w:tcPr>
-          <w:p>
-            <w:pPr>
+              <w:t>A</w:t>
+            </w:r>
+            <w:r>
+              <w:t>ttribute Name</w:t>
+            </w:r>
+          </w:p>
+        </w:tc>
+        <w:tc>
+          <w:tcPr>
+            <w:tcW w:w="2074" w:type="dxa"/>
+          </w:tcPr>
+          <w:p>
+            <w:r>
               <w:rPr>
                 <w:rFonts w:hint="eastAsia"/>
               </w:rPr>
-            </w:pPr>
-            <w:r>
-              <w:rPr>
-                <w:rFonts w:hint="eastAsia"/>
-              </w:rPr>
-              <w:t>A</w:t>
-            </w:r>
-            <w:r>
-              <w:t>ttribute Name</w:t>
-            </w:r>
-          </w:p>
-        </w:tc>
-        <w:tc>
-          <w:tcPr>
-            <w:tcW w:w="2074" w:type="dxa"/>
-          </w:tcPr>
-          <w:p>
-            <w:pPr>
-              <w:rPr>
-                <w:rFonts w:hint="eastAsia"/>
-              </w:rPr>
-            </w:pPr>
-            <w:r>
-              <w:rPr>
-                <w:rFonts w:hint="eastAsia"/>
-              </w:rPr>
               <w:t>T</w:t>
             </w:r>
             <w:r>
@@ -10822,11 +10285,6 @@
             <w:tcW w:w="2074" w:type="dxa"/>
           </w:tcPr>
           <w:p>
-            <w:pPr>
-              <w:rPr>
-                <w:rFonts w:hint="eastAsia"/>
-              </w:rPr>
-            </w:pPr>
             <w:r>
               <w:rPr>
                 <w:rFonts w:hint="eastAsia"/>
@@ -10845,54 +10303,39 @@
             <w:tcW w:w="2074" w:type="dxa"/>
           </w:tcPr>
           <w:p>
-            <w:pPr>
+            <w:r>
               <w:rPr>
                 <w:rFonts w:hint="eastAsia"/>
               </w:rPr>
-            </w:pPr>
+              <w:t>1</w:t>
+            </w:r>
+          </w:p>
+        </w:tc>
+        <w:tc>
+          <w:tcPr>
+            <w:tcW w:w="2074" w:type="dxa"/>
+          </w:tcPr>
+          <w:p>
             <w:r>
               <w:rPr>
                 <w:rFonts w:hint="eastAsia"/>
               </w:rPr>
-              <w:t>1</w:t>
-            </w:r>
-          </w:p>
-        </w:tc>
-        <w:tc>
-          <w:tcPr>
-            <w:tcW w:w="2074" w:type="dxa"/>
-          </w:tcPr>
-          <w:p>
-            <w:pPr>
+              <w:t>I</w:t>
+            </w:r>
+            <w:r>
+              <w:t>d</w:t>
+            </w:r>
+          </w:p>
+        </w:tc>
+        <w:tc>
+          <w:tcPr>
+            <w:tcW w:w="2074" w:type="dxa"/>
+          </w:tcPr>
+          <w:p>
+            <w:r>
               <w:rPr>
                 <w:rFonts w:hint="eastAsia"/>
               </w:rPr>
-            </w:pPr>
-            <w:r>
-              <w:rPr>
-                <w:rFonts w:hint="eastAsia"/>
-              </w:rPr>
-              <w:t>I</w:t>
-            </w:r>
-            <w:r>
-              <w:t>d</w:t>
-            </w:r>
-          </w:p>
-        </w:tc>
-        <w:tc>
-          <w:tcPr>
-            <w:tcW w:w="2074" w:type="dxa"/>
-          </w:tcPr>
-          <w:p>
-            <w:pPr>
-              <w:rPr>
-                <w:rFonts w:hint="eastAsia"/>
-              </w:rPr>
-            </w:pPr>
-            <w:r>
-              <w:rPr>
-                <w:rFonts w:hint="eastAsia"/>
-              </w:rPr>
               <w:t>B</w:t>
             </w:r>
             <w:r>
@@ -10905,11 +10348,6 @@
             <w:tcW w:w="2074" w:type="dxa"/>
           </w:tcPr>
           <w:p>
-            <w:pPr>
-              <w:rPr>
-                <w:rFonts w:hint="eastAsia"/>
-              </w:rPr>
-            </w:pPr>
             <w:r>
               <w:t>Autoincrement</w:t>
             </w:r>
@@ -10925,49 +10363,33 @@
             <w:tcW w:w="2074" w:type="dxa"/>
           </w:tcPr>
           <w:p>
-            <w:pPr>
+            <w:r>
               <w:rPr>
                 <w:rFonts w:hint="eastAsia"/>
               </w:rPr>
-            </w:pPr>
+              <w:t>2</w:t>
+            </w:r>
+          </w:p>
+        </w:tc>
+        <w:tc>
+          <w:tcPr>
+            <w:tcW w:w="2074" w:type="dxa"/>
+          </w:tcPr>
+          <w:p>
+            <w:r>
+              <w:t>Start_time</w:t>
+            </w:r>
+          </w:p>
+        </w:tc>
+        <w:tc>
+          <w:tcPr>
+            <w:tcW w:w="2074" w:type="dxa"/>
+          </w:tcPr>
+          <w:p>
             <w:r>
               <w:rPr>
                 <w:rFonts w:hint="eastAsia"/>
               </w:rPr>
-              <w:lastRenderedPageBreak/>
-              <w:t>2</w:t>
-            </w:r>
-          </w:p>
-        </w:tc>
-        <w:tc>
-          <w:tcPr>
-            <w:tcW w:w="2074" w:type="dxa"/>
-          </w:tcPr>
-          <w:p>
-            <w:pPr>
-              <w:rPr>
-                <w:rFonts w:hint="eastAsia"/>
-              </w:rPr>
-            </w:pPr>
-            <w:r>
-              <w:t>Start_time</w:t>
-            </w:r>
-          </w:p>
-        </w:tc>
-        <w:tc>
-          <w:tcPr>
-            <w:tcW w:w="2074" w:type="dxa"/>
-          </w:tcPr>
-          <w:p>
-            <w:pPr>
-              <w:rPr>
-                <w:rFonts w:hint="eastAsia"/>
-              </w:rPr>
-            </w:pPr>
-            <w:r>
-              <w:rPr>
-                <w:rFonts w:hint="eastAsia"/>
-              </w:rPr>
               <w:t>D</w:t>
             </w:r>
             <w:r>
@@ -10979,13 +10401,7 @@
           <w:tcPr>
             <w:tcW w:w="2074" w:type="dxa"/>
           </w:tcPr>
-          <w:p>
-            <w:pPr>
-              <w:rPr>
-                <w:rFonts w:hint="eastAsia"/>
-              </w:rPr>
-            </w:pPr>
-          </w:p>
+          <w:p/>
         </w:tc>
       </w:tr>
       <w:tr>
@@ -10994,54 +10410,39 @@
             <w:tcW w:w="2074" w:type="dxa"/>
           </w:tcPr>
           <w:p>
-            <w:pPr>
+            <w:r>
               <w:rPr>
                 <w:rFonts w:hint="eastAsia"/>
               </w:rPr>
-            </w:pPr>
+              <w:t>3</w:t>
+            </w:r>
+          </w:p>
+        </w:tc>
+        <w:tc>
+          <w:tcPr>
+            <w:tcW w:w="2074" w:type="dxa"/>
+          </w:tcPr>
+          <w:p>
             <w:r>
               <w:rPr>
                 <w:rFonts w:hint="eastAsia"/>
               </w:rPr>
-              <w:t>3</w:t>
-            </w:r>
-          </w:p>
-        </w:tc>
-        <w:tc>
-          <w:tcPr>
-            <w:tcW w:w="2074" w:type="dxa"/>
-          </w:tcPr>
-          <w:p>
-            <w:pPr>
+              <w:t>E</w:t>
+            </w:r>
+            <w:r>
+              <w:t>nd_time</w:t>
+            </w:r>
+          </w:p>
+        </w:tc>
+        <w:tc>
+          <w:tcPr>
+            <w:tcW w:w="2074" w:type="dxa"/>
+          </w:tcPr>
+          <w:p>
+            <w:r>
               <w:rPr>
                 <w:rFonts w:hint="eastAsia"/>
               </w:rPr>
-            </w:pPr>
-            <w:r>
-              <w:rPr>
-                <w:rFonts w:hint="eastAsia"/>
-              </w:rPr>
-              <w:t>E</w:t>
-            </w:r>
-            <w:r>
-              <w:t>nd_time</w:t>
-            </w:r>
-          </w:p>
-        </w:tc>
-        <w:tc>
-          <w:tcPr>
-            <w:tcW w:w="2074" w:type="dxa"/>
-          </w:tcPr>
-          <w:p>
-            <w:pPr>
-              <w:rPr>
-                <w:rFonts w:hint="eastAsia"/>
-              </w:rPr>
-            </w:pPr>
-            <w:r>
-              <w:rPr>
-                <w:rFonts w:hint="eastAsia"/>
-              </w:rPr>
               <w:t>D</w:t>
             </w:r>
             <w:r>
@@ -11053,13 +10454,7 @@
           <w:tcPr>
             <w:tcW w:w="2074" w:type="dxa"/>
           </w:tcPr>
-          <w:p>
-            <w:pPr>
-              <w:rPr>
-                <w:rFonts w:hint="eastAsia"/>
-              </w:rPr>
-            </w:pPr>
-          </w:p>
+          <w:p/>
         </w:tc>
       </w:tr>
     </w:tbl>
@@ -11115,6 +10510,26 @@
       </w:r>
       <w:r>
         <w:t>wap</w:t>
+      </w:r>
+    </w:p>
+    <w:p>
+      <w:r>
+        <w:rPr>
+          <w:rFonts w:hint="eastAsia"/>
+          <w:b/>
+          <w:bCs/>
+        </w:rPr>
+        <w:t>R</w:t>
+      </w:r>
+      <w:r>
+        <w:rPr>
+          <w:b/>
+          <w:bCs/>
+        </w:rPr>
+        <w:t>eason</w:t>
+      </w:r>
+      <w:r>
+        <w:t>: The app needs to track all open shifts and record the date these open shifts are made.</w:t>
       </w:r>
     </w:p>
     <w:tbl>
@@ -11135,57 +10550,42 @@
             <w:tcW w:w="2074" w:type="dxa"/>
           </w:tcPr>
           <w:p>
-            <w:pPr>
+            <w:r>
               <w:rPr>
                 <w:rFonts w:hint="eastAsia"/>
               </w:rPr>
-            </w:pPr>
+              <w:t>N</w:t>
+            </w:r>
+            <w:r>
+              <w:t xml:space="preserve">o. </w:t>
+            </w:r>
+          </w:p>
+        </w:tc>
+        <w:tc>
+          <w:tcPr>
+            <w:tcW w:w="2074" w:type="dxa"/>
+          </w:tcPr>
+          <w:p>
             <w:r>
               <w:rPr>
                 <w:rFonts w:hint="eastAsia"/>
               </w:rPr>
-              <w:t>N</w:t>
-            </w:r>
-            <w:r>
-              <w:t xml:space="preserve">o. </w:t>
-            </w:r>
-          </w:p>
-        </w:tc>
-        <w:tc>
-          <w:tcPr>
-            <w:tcW w:w="2074" w:type="dxa"/>
-          </w:tcPr>
-          <w:p>
-            <w:pPr>
+              <w:t>A</w:t>
+            </w:r>
+            <w:r>
+              <w:t>ttribute Name</w:t>
+            </w:r>
+          </w:p>
+        </w:tc>
+        <w:tc>
+          <w:tcPr>
+            <w:tcW w:w="2074" w:type="dxa"/>
+          </w:tcPr>
+          <w:p>
+            <w:r>
               <w:rPr>
                 <w:rFonts w:hint="eastAsia"/>
               </w:rPr>
-            </w:pPr>
-            <w:r>
-              <w:rPr>
-                <w:rFonts w:hint="eastAsia"/>
-              </w:rPr>
-              <w:t>A</w:t>
-            </w:r>
-            <w:r>
-              <w:t>ttribute Name</w:t>
-            </w:r>
-          </w:p>
-        </w:tc>
-        <w:tc>
-          <w:tcPr>
-            <w:tcW w:w="2074" w:type="dxa"/>
-          </w:tcPr>
-          <w:p>
-            <w:pPr>
-              <w:rPr>
-                <w:rFonts w:hint="eastAsia"/>
-              </w:rPr>
-            </w:pPr>
-            <w:r>
-              <w:rPr>
-                <w:rFonts w:hint="eastAsia"/>
-              </w:rPr>
               <w:t>T</w:t>
             </w:r>
             <w:r>
@@ -11198,11 +10598,6 @@
             <w:tcW w:w="2074" w:type="dxa"/>
           </w:tcPr>
           <w:p>
-            <w:pPr>
-              <w:rPr>
-                <w:rFonts w:hint="eastAsia"/>
-              </w:rPr>
-            </w:pPr>
             <w:r>
               <w:rPr>
                 <w:rFonts w:hint="eastAsia"/>
@@ -11221,54 +10616,40 @@
             <w:tcW w:w="2074" w:type="dxa"/>
           </w:tcPr>
           <w:p>
-            <w:pPr>
+            <w:r>
               <w:rPr>
                 <w:rFonts w:hint="eastAsia"/>
               </w:rPr>
-            </w:pPr>
+              <w:lastRenderedPageBreak/>
+              <w:t>1</w:t>
+            </w:r>
+          </w:p>
+        </w:tc>
+        <w:tc>
+          <w:tcPr>
+            <w:tcW w:w="2074" w:type="dxa"/>
+          </w:tcPr>
+          <w:p>
             <w:r>
               <w:rPr>
                 <w:rFonts w:hint="eastAsia"/>
               </w:rPr>
-              <w:t>1</w:t>
-            </w:r>
-          </w:p>
-        </w:tc>
-        <w:tc>
-          <w:tcPr>
-            <w:tcW w:w="2074" w:type="dxa"/>
-          </w:tcPr>
-          <w:p>
-            <w:pPr>
+              <w:t>I</w:t>
+            </w:r>
+            <w:r>
+              <w:t>d</w:t>
+            </w:r>
+          </w:p>
+        </w:tc>
+        <w:tc>
+          <w:tcPr>
+            <w:tcW w:w="2074" w:type="dxa"/>
+          </w:tcPr>
+          <w:p>
+            <w:r>
               <w:rPr>
                 <w:rFonts w:hint="eastAsia"/>
               </w:rPr>
-            </w:pPr>
-            <w:r>
-              <w:rPr>
-                <w:rFonts w:hint="eastAsia"/>
-              </w:rPr>
-              <w:t>I</w:t>
-            </w:r>
-            <w:r>
-              <w:t>d</w:t>
-            </w:r>
-          </w:p>
-        </w:tc>
-        <w:tc>
-          <w:tcPr>
-            <w:tcW w:w="2074" w:type="dxa"/>
-          </w:tcPr>
-          <w:p>
-            <w:pPr>
-              <w:rPr>
-                <w:rFonts w:hint="eastAsia"/>
-              </w:rPr>
-            </w:pPr>
-            <w:r>
-              <w:rPr>
-                <w:rFonts w:hint="eastAsia"/>
-              </w:rPr>
               <w:t>B</w:t>
             </w:r>
             <w:r>
@@ -11281,11 +10662,6 @@
             <w:tcW w:w="2074" w:type="dxa"/>
           </w:tcPr>
           <w:p>
-            <w:pPr>
-              <w:rPr>
-                <w:rFonts w:hint="eastAsia"/>
-              </w:rPr>
-            </w:pPr>
             <w:r>
               <w:rPr>
                 <w:rFonts w:hint="eastAsia"/>
@@ -11304,48 +10680,33 @@
             <w:tcW w:w="2074" w:type="dxa"/>
           </w:tcPr>
           <w:p>
-            <w:pPr>
+            <w:r>
               <w:rPr>
                 <w:rFonts w:hint="eastAsia"/>
               </w:rPr>
-            </w:pPr>
+              <w:t>2</w:t>
+            </w:r>
+          </w:p>
+        </w:tc>
+        <w:tc>
+          <w:tcPr>
+            <w:tcW w:w="2074" w:type="dxa"/>
+          </w:tcPr>
+          <w:p>
+            <w:r>
+              <w:t>From</w:t>
+            </w:r>
+          </w:p>
+        </w:tc>
+        <w:tc>
+          <w:tcPr>
+            <w:tcW w:w="2074" w:type="dxa"/>
+          </w:tcPr>
+          <w:p>
             <w:r>
               <w:rPr>
                 <w:rFonts w:hint="eastAsia"/>
               </w:rPr>
-              <w:t>2</w:t>
-            </w:r>
-          </w:p>
-        </w:tc>
-        <w:tc>
-          <w:tcPr>
-            <w:tcW w:w="2074" w:type="dxa"/>
-          </w:tcPr>
-          <w:p>
-            <w:pPr>
-              <w:rPr>
-                <w:rFonts w:hint="eastAsia"/>
-              </w:rPr>
-            </w:pPr>
-            <w:r>
-              <w:t>From</w:t>
-            </w:r>
-          </w:p>
-        </w:tc>
-        <w:tc>
-          <w:tcPr>
-            <w:tcW w:w="2074" w:type="dxa"/>
-          </w:tcPr>
-          <w:p>
-            <w:pPr>
-              <w:rPr>
-                <w:rFonts w:hint="eastAsia"/>
-              </w:rPr>
-            </w:pPr>
-            <w:r>
-              <w:rPr>
-                <w:rFonts w:hint="eastAsia"/>
-              </w:rPr>
               <w:t>D</w:t>
             </w:r>
             <w:r>
@@ -11358,11 +10719,6 @@
             <w:tcW w:w="2074" w:type="dxa"/>
           </w:tcPr>
           <w:p>
-            <w:pPr>
-              <w:rPr>
-                <w:rFonts w:hint="eastAsia"/>
-              </w:rPr>
-            </w:pPr>
             <w:r>
               <w:t>Not null</w:t>
             </w:r>
@@ -11375,54 +10731,39 @@
             <w:tcW w:w="2074" w:type="dxa"/>
           </w:tcPr>
           <w:p>
-            <w:pPr>
+            <w:r>
               <w:rPr>
                 <w:rFonts w:hint="eastAsia"/>
               </w:rPr>
-            </w:pPr>
+              <w:t>3</w:t>
+            </w:r>
+          </w:p>
+        </w:tc>
+        <w:tc>
+          <w:tcPr>
+            <w:tcW w:w="2074" w:type="dxa"/>
+          </w:tcPr>
+          <w:p>
             <w:r>
               <w:rPr>
                 <w:rFonts w:hint="eastAsia"/>
               </w:rPr>
-              <w:t>3</w:t>
-            </w:r>
-          </w:p>
-        </w:tc>
-        <w:tc>
-          <w:tcPr>
-            <w:tcW w:w="2074" w:type="dxa"/>
-          </w:tcPr>
-          <w:p>
-            <w:pPr>
+              <w:t>T</w:t>
+            </w:r>
+            <w:r>
+              <w:t>o</w:t>
+            </w:r>
+          </w:p>
+        </w:tc>
+        <w:tc>
+          <w:tcPr>
+            <w:tcW w:w="2074" w:type="dxa"/>
+          </w:tcPr>
+          <w:p>
+            <w:r>
               <w:rPr>
                 <w:rFonts w:hint="eastAsia"/>
               </w:rPr>
-            </w:pPr>
-            <w:r>
-              <w:rPr>
-                <w:rFonts w:hint="eastAsia"/>
-              </w:rPr>
-              <w:t>T</w:t>
-            </w:r>
-            <w:r>
-              <w:t>o</w:t>
-            </w:r>
-          </w:p>
-        </w:tc>
-        <w:tc>
-          <w:tcPr>
-            <w:tcW w:w="2074" w:type="dxa"/>
-          </w:tcPr>
-          <w:p>
-            <w:pPr>
-              <w:rPr>
-                <w:rFonts w:hint="eastAsia"/>
-              </w:rPr>
-            </w:pPr>
-            <w:r>
-              <w:rPr>
-                <w:rFonts w:hint="eastAsia"/>
-              </w:rPr>
               <w:t>D</w:t>
             </w:r>
             <w:r>
@@ -11435,11 +10776,6 @@
             <w:tcW w:w="2074" w:type="dxa"/>
           </w:tcPr>
           <w:p>
-            <w:pPr>
-              <w:rPr>
-                <w:rFonts w:hint="eastAsia"/>
-              </w:rPr>
-            </w:pPr>
             <w:r>
               <w:t>Not null</w:t>
             </w:r>
@@ -11464,6 +10800,31 @@
       </w:r>
       <w:r>
         <w:t>pen_shift</w:t>
+      </w:r>
+    </w:p>
+    <w:p>
+      <w:pPr>
+        <w:rPr>
+          <w:rFonts w:hint="eastAsia"/>
+        </w:rPr>
+      </w:pPr>
+      <w:r>
+        <w:rPr>
+          <w:rFonts w:hint="eastAsia"/>
+          <w:b/>
+          <w:bCs/>
+        </w:rPr>
+        <w:t>R</w:t>
+      </w:r>
+      <w:r>
+        <w:rPr>
+          <w:b/>
+          <w:bCs/>
+        </w:rPr>
+        <w:t>eason</w:t>
+      </w:r>
+      <w:r>
+        <w:t>: The app needs to keep track of which shifts are open and assign open shifts to active free staff</w:t>
       </w:r>
     </w:p>
     <w:tbl>
@@ -11484,51 +10845,36 @@
             <w:tcW w:w="2074" w:type="dxa"/>
           </w:tcPr>
           <w:p>
-            <w:pPr>
+            <w:r>
+              <w:t>No.</w:t>
+            </w:r>
+          </w:p>
+        </w:tc>
+        <w:tc>
+          <w:tcPr>
+            <w:tcW w:w="2074" w:type="dxa"/>
+          </w:tcPr>
+          <w:p>
+            <w:r>
               <w:rPr>
                 <w:rFonts w:hint="eastAsia"/>
               </w:rPr>
-            </w:pPr>
-            <w:r>
-              <w:t>No.</w:t>
-            </w:r>
-          </w:p>
-        </w:tc>
-        <w:tc>
-          <w:tcPr>
-            <w:tcW w:w="2074" w:type="dxa"/>
-          </w:tcPr>
-          <w:p>
-            <w:pPr>
+              <w:t>A</w:t>
+            </w:r>
+            <w:r>
+              <w:t>ttribute Name</w:t>
+            </w:r>
+          </w:p>
+        </w:tc>
+        <w:tc>
+          <w:tcPr>
+            <w:tcW w:w="2074" w:type="dxa"/>
+          </w:tcPr>
+          <w:p>
+            <w:r>
               <w:rPr>
                 <w:rFonts w:hint="eastAsia"/>
               </w:rPr>
-            </w:pPr>
-            <w:r>
-              <w:rPr>
-                <w:rFonts w:hint="eastAsia"/>
-              </w:rPr>
-              <w:t>A</w:t>
-            </w:r>
-            <w:r>
-              <w:t>ttribute Name</w:t>
-            </w:r>
-          </w:p>
-        </w:tc>
-        <w:tc>
-          <w:tcPr>
-            <w:tcW w:w="2074" w:type="dxa"/>
-          </w:tcPr>
-          <w:p>
-            <w:pPr>
-              <w:rPr>
-                <w:rFonts w:hint="eastAsia"/>
-              </w:rPr>
-            </w:pPr>
-            <w:r>
-              <w:rPr>
-                <w:rFonts w:hint="eastAsia"/>
-              </w:rPr>
               <w:t>T</w:t>
             </w:r>
             <w:r>
@@ -11541,11 +10887,6 @@
             <w:tcW w:w="2074" w:type="dxa"/>
           </w:tcPr>
           <w:p>
-            <w:pPr>
-              <w:rPr>
-                <w:rFonts w:hint="eastAsia"/>
-              </w:rPr>
-            </w:pPr>
             <w:r>
               <w:rPr>
                 <w:rFonts w:hint="eastAsia"/>
@@ -11564,57 +10905,42 @@
             <w:tcW w:w="2074" w:type="dxa"/>
           </w:tcPr>
           <w:p>
-            <w:pPr>
+            <w:r>
               <w:rPr>
                 <w:rFonts w:hint="eastAsia"/>
               </w:rPr>
-            </w:pPr>
+              <w:t>1</w:t>
+            </w:r>
+          </w:p>
+        </w:tc>
+        <w:tc>
+          <w:tcPr>
+            <w:tcW w:w="2074" w:type="dxa"/>
+          </w:tcPr>
+          <w:p>
             <w:r>
               <w:rPr>
                 <w:rFonts w:hint="eastAsia"/>
               </w:rPr>
-              <w:t>1</w:t>
-            </w:r>
-          </w:p>
-        </w:tc>
-        <w:tc>
-          <w:tcPr>
-            <w:tcW w:w="2074" w:type="dxa"/>
-          </w:tcPr>
-          <w:p>
-            <w:pPr>
+              <w:t>D</w:t>
+            </w:r>
+            <w:r>
+              <w:t>ate_made</w:t>
+            </w:r>
+          </w:p>
+        </w:tc>
+        <w:tc>
+          <w:tcPr>
+            <w:tcW w:w="2074" w:type="dxa"/>
+          </w:tcPr>
+          <w:p>
+            <w:r>
               <w:rPr>
                 <w:rFonts w:hint="eastAsia"/>
               </w:rPr>
-            </w:pPr>
-            <w:r>
-              <w:rPr>
-                <w:rFonts w:hint="eastAsia"/>
-              </w:rPr>
               <w:t>D</w:t>
             </w:r>
             <w:r>
-              <w:t>ate_made</w:t>
-            </w:r>
-          </w:p>
-        </w:tc>
-        <w:tc>
-          <w:tcPr>
-            <w:tcW w:w="2074" w:type="dxa"/>
-          </w:tcPr>
-          <w:p>
-            <w:pPr>
-              <w:rPr>
-                <w:rFonts w:hint="eastAsia"/>
-              </w:rPr>
-            </w:pPr>
-            <w:r>
-              <w:rPr>
-                <w:rFonts w:hint="eastAsia"/>
-              </w:rPr>
-              <w:t>D</w:t>
-            </w:r>
-            <w:r>
               <w:t>ATETIME</w:t>
             </w:r>
           </w:p>
@@ -11624,11 +10950,6 @@
             <w:tcW w:w="2074" w:type="dxa"/>
           </w:tcPr>
           <w:p>
-            <w:pPr>
-              <w:rPr>
-                <w:rFonts w:hint="eastAsia"/>
-              </w:rPr>
-            </w:pPr>
             <w:r>
               <w:t>Not null with default being current time</w:t>
             </w:r>
@@ -11636,13 +10957,7 @@
         </w:tc>
       </w:tr>
     </w:tbl>
-    <w:p>
-      <w:pPr>
-        <w:rPr>
-          <w:rFonts w:hint="eastAsia"/>
-        </w:rPr>
-      </w:pPr>
-    </w:p>
+    <w:p/>
     <w:sectPr>
       <w:pgSz w:w="11906" w:h="16838"/>
       <w:pgMar w:top="1440" w:right="1800" w:bottom="1440" w:left="1800" w:header="851" w:footer="992" w:gutter="0"/>

</xml_diff>